<commit_message>
Added temp screws below door on front wall; cleaned up drawings on platform and rear wall; larger font for all docs, in manual-template.docx
</commit_message>
<xml_diff>
--- a/Platform/Platform_dbl_side.docx
+++ b/Platform/Platform_dbl_side.docx
@@ -2,7 +2,7 @@
 <file path=word/document.xml><?xml version="1.0" encoding="utf-8"?>
 <w:document xmlns:w="http://schemas.openxmlformats.org/wordprocessingml/2006/main" xmlns:m="http://schemas.openxmlformats.org/officeDocument/2006/math" xmlns:r="http://schemas.openxmlformats.org/officeDocument/2006/relationships" xmlns:o="urn:schemas-microsoft-com:office:office" xmlns:v="urn:schemas-microsoft-com:vml" xmlns:w10="urn:schemas-microsoft-com:office:word" xmlns:a="http://schemas.openxmlformats.org/drawingml/2006/main" xmlns:pic="http://schemas.openxmlformats.org/drawingml/2006/picture" xmlns:wp="http://schemas.openxmlformats.org/drawingml/2006/wordprocessingDrawing">
   <w:body>
-    <w:bookmarkStart w:id="98" w:name="platform---set-up-list"/>
+    <w:bookmarkStart w:id="72" w:name="platform---set-up-list"/>
     <w:p>
       <w:pPr>
         <w:pStyle w:val="Heading1"/>
@@ -165,7 +165,7 @@
         <w:br w:type="page"/>
       </w:r>
     </w:p>
-    <w:bookmarkStart w:id="25" w:name="step-1"/>
+    <w:bookmarkStart w:id="23" w:name="step-1"/>
     <w:p>
       <w:pPr>
         <w:pStyle w:val="Heading2"/>
@@ -271,89 +271,55 @@
         <w:br w:type="page"/>
       </w:r>
     </w:p>
-    <w:tbl>
-      <w:tblPr>
-        <w:tblStyle w:val="Table"/>
-        <w:tblW w:type="pct" w:w="5000"/>
-        <w:tblLayout w:type="fixed"/>
-        <w:tblLook w:firstRow="0" w:lastRow="0" w:firstColumn="0" w:lastColumn="0" w:noHBand="0" w:noVBand="0" w:val="0000"/>
-      </w:tblPr>
-      <w:tblGrid>
-        <w:gridCol w:w="7920"/>
-      </w:tblGrid>
-      <w:tr>
-        <w:tc>
-          <w:tcPr/>
-          <w:bookmarkStart w:id="24" w:name="fig-539a35d47e664c97a50115a146a7f1bd-1"/>
-          <w:p>
-            <w:pPr>
-              <w:pStyle w:val="Compact"/>
-              <w:jc w:val="center"/>
-            </w:pPr>
-            <w:bookmarkStart w:id="23" w:name="fig-539a35d47e664c97a50115a146a7f1bd-1"/>
-            <w:r>
-              <w:drawing>
-                <wp:inline>
-                  <wp:extent cx="5943600" cy="8229600"/>
-                  <wp:effectExtent b="0" l="0" r="0" t="0"/>
-                  <wp:docPr descr=" " title="" id="21" name="Picture"/>
-                  <a:graphic>
-                    <a:graphicData uri="http://schemas.openxmlformats.org/drawingml/2006/picture">
-                      <pic:pic>
-                        <pic:nvPicPr>
-                          <pic:cNvPr descr="images/platform_dbl_01.png" id="22" name="Picture"/>
-                          <pic:cNvPicPr>
-                            <a:picLocks noChangeArrowheads="1" noChangeAspect="1"/>
-                          </pic:cNvPicPr>
-                        </pic:nvPicPr>
-                        <pic:blipFill>
-                          <a:blip r:embed="rId20"/>
-                          <a:stretch>
-                            <a:fillRect/>
-                          </a:stretch>
-                        </pic:blipFill>
-                        <pic:spPr bwMode="auto">
-                          <a:xfrm>
-                            <a:off x="0" y="0"/>
-                            <a:ext cx="5943600" cy="8229600"/>
-                          </a:xfrm>
-                          <a:prstGeom prst="rect">
-                            <a:avLst/>
-                          </a:prstGeom>
-                          <a:noFill/>
-                          <a:ln w="9525">
-                            <a:noFill/>
-                            <a:headEnd/>
-                            <a:tailEnd/>
-                          </a:ln>
-                        </pic:spPr>
-                      </pic:pic>
-                    </a:graphicData>
-                  </a:graphic>
-                </wp:inline>
-              </w:drawing>
-            </w:r>
-            <w:bookmarkEnd w:id="23"/>
-          </w:p>
-          <w:p>
-            <w:pPr>
-              <w:jc w:val="center"/>
-            </w:pPr>
-            <w:pPr>
-              <w:jc w:val="start"/>
-              <w:spacing w:before="200"/>
-              <w:pStyle w:val="ImageCaption"/>
-            </w:pPr>
-            <w:r>
-              <w:t xml:space="preserve"> </w:t>
-            </w:r>
-          </w:p>
-          <w:bookmarkEnd w:id="24"/>
-        </w:tc>
-      </w:tr>
-    </w:tbl>
-    <w:bookmarkEnd w:id="25"/>
-    <w:bookmarkStart w:id="31" w:name="step-2"/>
+    <w:p>
+      <w:pPr>
+        <w:pStyle w:val="FirstParagraph"/>
+      </w:pPr>
+      <w:r>
+        <w:drawing>
+          <wp:inline>
+            <wp:extent cx="5943600" cy="8229600"/>
+            <wp:effectExtent b="0" l="0" r="0" t="0"/>
+            <wp:docPr descr="" title="" id="21" name="Picture"/>
+            <a:graphic>
+              <a:graphicData uri="http://schemas.openxmlformats.org/drawingml/2006/picture">
+                <pic:pic>
+                  <pic:nvPicPr>
+                    <pic:cNvPr descr="images/platform_dbl_01.png" id="22" name="Picture"/>
+                    <pic:cNvPicPr>
+                      <a:picLocks noChangeArrowheads="1" noChangeAspect="1"/>
+                    </pic:cNvPicPr>
+                  </pic:nvPicPr>
+                  <pic:blipFill>
+                    <a:blip r:embed="rId20"/>
+                    <a:stretch>
+                      <a:fillRect/>
+                    </a:stretch>
+                  </pic:blipFill>
+                  <pic:spPr bwMode="auto">
+                    <a:xfrm>
+                      <a:off x="0" y="0"/>
+                      <a:ext cx="5943600" cy="8229600"/>
+                    </a:xfrm>
+                    <a:prstGeom prst="rect">
+                      <a:avLst/>
+                    </a:prstGeom>
+                    <a:noFill/>
+                    <a:ln w="9525">
+                      <a:noFill/>
+                      <a:headEnd/>
+                      <a:tailEnd/>
+                    </a:ln>
+                  </pic:spPr>
+                </pic:pic>
+              </a:graphicData>
+            </a:graphic>
+          </wp:inline>
+        </w:drawing>
+      </w:r>
+    </w:p>
+    <w:bookmarkEnd w:id="23"/>
+    <w:bookmarkStart w:id="27" w:name="step-2"/>
     <w:p>
       <w:pPr>
         <w:pStyle w:val="Heading2"/>
@@ -393,7 +359,7 @@
         <w:br/>
       </w:r>
       <w:r>
-        <w:t xml:space="preserve">— nail these 2x6 together 8 places, centered vertically</w:t>
+        <w:t xml:space="preserve">— nail these 2x6 together 4 places, centered vertically. Repeat on other end</w:t>
       </w:r>
     </w:p>
     <w:p>
@@ -404,36 +370,253 @@
         </w:numPr>
       </w:pPr>
       <w:r>
+        <w:t xml:space="preserve">Team leader</w:t>
+      </w:r>
+      <w:r>
+        <w:br/>
+      </w:r>
+      <w:r>
+        <w:t xml:space="preserve">— using the triangle, mark a line on the outside of the long 2x6s</w:t>
+      </w:r>
+      <w:r>
+        <w:t xml:space="preserve"> </w:t>
+      </w:r>
+      <w:r>
+        <w:t xml:space="preserve">at the middle of the ends of each joist to indicate where the nails</w:t>
+      </w:r>
+      <w:r>
+        <w:t xml:space="preserve"> </w:t>
+      </w:r>
+      <w:r>
+        <w:t xml:space="preserve">go.</w:t>
+      </w:r>
+    </w:p>
+    <w:p>
+      <w:r>
+        <w:br w:type="page"/>
+      </w:r>
+    </w:p>
+    <w:p>
+      <w:pPr>
+        <w:pStyle w:val="FirstParagraph"/>
+      </w:pPr>
+      <w:r>
+        <w:drawing>
+          <wp:inline>
+            <wp:extent cx="5943600" cy="8229600"/>
+            <wp:effectExtent b="0" l="0" r="0" t="0"/>
+            <wp:docPr descr="" title="" id="25" name="Picture"/>
+            <a:graphic>
+              <a:graphicData uri="http://schemas.openxmlformats.org/drawingml/2006/picture">
+                <pic:pic>
+                  <pic:nvPicPr>
+                    <pic:cNvPr descr="images/platform_dbl_02.png" id="26" name="Picture"/>
+                    <pic:cNvPicPr>
+                      <a:picLocks noChangeArrowheads="1" noChangeAspect="1"/>
+                    </pic:cNvPicPr>
+                  </pic:nvPicPr>
+                  <pic:blipFill>
+                    <a:blip r:embed="rId24"/>
+                    <a:stretch>
+                      <a:fillRect/>
+                    </a:stretch>
+                  </pic:blipFill>
+                  <pic:spPr bwMode="auto">
+                    <a:xfrm>
+                      <a:off x="0" y="0"/>
+                      <a:ext cx="5943600" cy="8229600"/>
+                    </a:xfrm>
+                    <a:prstGeom prst="rect">
+                      <a:avLst/>
+                    </a:prstGeom>
+                    <a:noFill/>
+                    <a:ln w="9525">
+                      <a:noFill/>
+                      <a:headEnd/>
+                      <a:tailEnd/>
+                    </a:ln>
+                  </pic:spPr>
+                </pic:pic>
+              </a:graphicData>
+            </a:graphic>
+          </wp:inline>
+        </w:drawing>
+      </w:r>
+    </w:p>
+    <w:bookmarkEnd w:id="27"/>
+    <w:bookmarkStart w:id="31" w:name="step-3"/>
+    <w:p>
+      <w:pPr>
+        <w:pStyle w:val="Heading2"/>
+      </w:pPr>
+      <w:r>
+        <w:t xml:space="preserve">Step 3</w:t>
+      </w:r>
+    </w:p>
+    <w:p>
+      <w:pPr>
+        <w:pStyle w:val="Compact"/>
+        <w:numPr>
+          <w:ilvl w:val="0"/>
+          <w:numId w:val="1004"/>
+        </w:numPr>
+      </w:pPr>
+      <w:r>
         <w:t xml:space="preserve">Put in all the inner 2x6 joists</w:t>
       </w:r>
     </w:p>
     <w:p>
       <w:pPr>
-        <w:numPr>
-          <w:ilvl w:val="0"/>
-          <w:numId w:val="1003"/>
-        </w:numPr>
-      </w:pPr>
-      <w:r>
-        <w:t xml:space="preserve">Team leader</w:t>
+        <w:pStyle w:val="Compact"/>
+        <w:numPr>
+          <w:ilvl w:val="0"/>
+          <w:numId w:val="1004"/>
+        </w:numPr>
+      </w:pPr>
+      <w:r>
+        <w:t xml:space="preserve">Put 3 nails in a vertical line on both ends of each joist</w:t>
       </w:r>
       <w:r>
         <w:br/>
       </w:r>
       <w:r>
-        <w:t xml:space="preserve">— using the triangle, mark a line on the outside of the long 2x6s</w:t>
+        <w:t xml:space="preserve">— make sure joists are flush before nailing; one person holds the joist in position</w:t>
       </w:r>
       <w:r>
         <w:t xml:space="preserve"> </w:t>
       </w:r>
       <w:r>
-        <w:t xml:space="preserve">at the middle of the ends of each joist to indicate where the nails</w:t>
+        <w:t xml:space="preserve">while the second person nails.</w:t>
+      </w:r>
+      <w:r>
+        <w:br/>
+      </w:r>
+      <w:r>
+        <w:t xml:space="preserve">— include 3 nails in the doubled joist ends</w:t>
+      </w:r>
+    </w:p>
+    <w:p>
+      <w:r>
+        <w:br w:type="page"/>
+      </w:r>
+    </w:p>
+    <w:p>
+      <w:pPr>
+        <w:pStyle w:val="FirstParagraph"/>
+      </w:pPr>
+      <w:r>
+        <w:drawing>
+          <wp:inline>
+            <wp:extent cx="5943600" cy="8229600"/>
+            <wp:effectExtent b="0" l="0" r="0" t="0"/>
+            <wp:docPr descr="" title="" id="29" name="Picture"/>
+            <a:graphic>
+              <a:graphicData uri="http://schemas.openxmlformats.org/drawingml/2006/picture">
+                <pic:pic>
+                  <pic:nvPicPr>
+                    <pic:cNvPr descr="images/platform_dbl_03.png" id="30" name="Picture"/>
+                    <pic:cNvPicPr>
+                      <a:picLocks noChangeArrowheads="1" noChangeAspect="1"/>
+                    </pic:cNvPicPr>
+                  </pic:nvPicPr>
+                  <pic:blipFill>
+                    <a:blip r:embed="rId28"/>
+                    <a:stretch>
+                      <a:fillRect/>
+                    </a:stretch>
+                  </pic:blipFill>
+                  <pic:spPr bwMode="auto">
+                    <a:xfrm>
+                      <a:off x="0" y="0"/>
+                      <a:ext cx="5943600" cy="8229600"/>
+                    </a:xfrm>
+                    <a:prstGeom prst="rect">
+                      <a:avLst/>
+                    </a:prstGeom>
+                    <a:noFill/>
+                    <a:ln w="9525">
+                      <a:noFill/>
+                      <a:headEnd/>
+                      <a:tailEnd/>
+                    </a:ln>
+                  </pic:spPr>
+                </pic:pic>
+              </a:graphicData>
+            </a:graphic>
+          </wp:inline>
+        </w:drawing>
+      </w:r>
+    </w:p>
+    <w:bookmarkEnd w:id="31"/>
+    <w:bookmarkStart w:id="35" w:name="step-4"/>
+    <w:p>
+      <w:pPr>
+        <w:pStyle w:val="Heading2"/>
+      </w:pPr>
+      <w:r>
+        <w:t xml:space="preserve">Step 4</w:t>
+      </w:r>
+    </w:p>
+    <w:p>
+      <w:pPr>
+        <w:numPr>
+          <w:ilvl w:val="0"/>
+          <w:numId w:val="1005"/>
+        </w:numPr>
+      </w:pPr>
+      <w:r>
+        <w:t xml:space="preserve">Remove the jenga blocks from outside the long sides of the frame.</w:t>
+      </w:r>
+    </w:p>
+    <w:p>
+      <w:pPr>
+        <w:numPr>
+          <w:ilvl w:val="0"/>
+          <w:numId w:val="1005"/>
+        </w:numPr>
+      </w:pPr>
+      <w:r>
+        <w:t xml:space="preserve">Position a long 2x6 outside each long side of the frame.</w:t>
+      </w:r>
+    </w:p>
+    <w:p>
+      <w:pPr>
+        <w:numPr>
+          <w:ilvl w:val="0"/>
+          <w:numId w:val="1005"/>
+        </w:numPr>
+      </w:pPr>
+      <w:r>
+        <w:t xml:space="preserve">Using clamps as necessary to align the two long boards, nail these</w:t>
       </w:r>
       <w:r>
         <w:t xml:space="preserve"> </w:t>
       </w:r>
       <w:r>
-        <w:t xml:space="preserve">go.</w:t>
+        <w:t xml:space="preserve">boards together, one nail in the middle of each bay (between the</w:t>
+      </w:r>
+      <w:r>
+        <w:t xml:space="preserve"> </w:t>
+      </w:r>
+      <w:r>
+        <w:t xml:space="preserve">joists), centered vertically, and 3 nails at each end of the long sides</w:t>
+      </w:r>
+    </w:p>
+    <w:p>
+      <w:pPr>
+        <w:numPr>
+          <w:ilvl w:val="0"/>
+          <w:numId w:val="1005"/>
+        </w:numPr>
+      </w:pPr>
+      <w:r>
+        <w:t xml:space="preserve">Use a pry bar to lift the frame out of the jig and slip a jenga</w:t>
+      </w:r>
+      <w:r>
+        <w:t xml:space="preserve"> </w:t>
+      </w:r>
+      <w:r>
+        <w:t xml:space="preserve">block under the long boards in 3 places on each side</w:t>
       </w:r>
     </w:p>
     <w:p>
@@ -441,492 +624,174 @@
         <w:br w:type="page"/>
       </w:r>
     </w:p>
-    <w:tbl>
-      <w:tblPr>
-        <w:tblStyle w:val="Table"/>
-        <w:tblW w:type="pct" w:w="5000"/>
-        <w:tblLayout w:type="fixed"/>
-        <w:tblLook w:firstRow="0" w:lastRow="0" w:firstColumn="0" w:lastColumn="0" w:noHBand="0" w:noVBand="0" w:val="0000"/>
-      </w:tblPr>
-      <w:tblGrid>
-        <w:gridCol w:w="7920"/>
-      </w:tblGrid>
-      <w:tr>
-        <w:tc>
-          <w:tcPr/>
-          <w:bookmarkStart w:id="30" w:name="fig-539a35d47e664c97a50115a146a7f1bd-2"/>
-          <w:p>
-            <w:pPr>
-              <w:pStyle w:val="Compact"/>
-              <w:jc w:val="center"/>
-            </w:pPr>
-            <w:bookmarkStart w:id="29" w:name="fig-539a35d47e664c97a50115a146a7f1bd-2"/>
-            <w:r>
-              <w:drawing>
-                <wp:inline>
-                  <wp:extent cx="5943600" cy="8229600"/>
-                  <wp:effectExtent b="0" l="0" r="0" t="0"/>
-                  <wp:docPr descr=" " title="" id="27" name="Picture"/>
-                  <a:graphic>
-                    <a:graphicData uri="http://schemas.openxmlformats.org/drawingml/2006/picture">
-                      <pic:pic>
-                        <pic:nvPicPr>
-                          <pic:cNvPr descr="images/platform_dbl_02.png" id="28" name="Picture"/>
-                          <pic:cNvPicPr>
-                            <a:picLocks noChangeArrowheads="1" noChangeAspect="1"/>
-                          </pic:cNvPicPr>
-                        </pic:nvPicPr>
-                        <pic:blipFill>
-                          <a:blip r:embed="rId26"/>
-                          <a:stretch>
-                            <a:fillRect/>
-                          </a:stretch>
-                        </pic:blipFill>
-                        <pic:spPr bwMode="auto">
-                          <a:xfrm>
-                            <a:off x="0" y="0"/>
-                            <a:ext cx="5943600" cy="8229600"/>
-                          </a:xfrm>
-                          <a:prstGeom prst="rect">
-                            <a:avLst/>
-                          </a:prstGeom>
-                          <a:noFill/>
-                          <a:ln w="9525">
-                            <a:noFill/>
-                            <a:headEnd/>
-                            <a:tailEnd/>
-                          </a:ln>
-                        </pic:spPr>
-                      </pic:pic>
-                    </a:graphicData>
-                  </a:graphic>
-                </wp:inline>
-              </w:drawing>
-            </w:r>
-            <w:bookmarkEnd w:id="29"/>
-          </w:p>
-          <w:p>
-            <w:pPr>
-              <w:jc w:val="center"/>
-            </w:pPr>
-            <w:pPr>
-              <w:jc w:val="start"/>
-              <w:spacing w:before="200"/>
-              <w:pStyle w:val="ImageCaption"/>
-            </w:pPr>
-            <w:r>
-              <w:t xml:space="preserve"> </w:t>
-            </w:r>
-          </w:p>
-          <w:bookmarkEnd w:id="30"/>
-        </w:tc>
-      </w:tr>
-    </w:tbl>
-    <w:bookmarkEnd w:id="31"/>
-    <w:bookmarkStart w:id="37" w:name="step-3"/>
+    <w:p>
+      <w:pPr>
+        <w:pStyle w:val="FirstParagraph"/>
+      </w:pPr>
+      <w:r>
+        <w:drawing>
+          <wp:inline>
+            <wp:extent cx="5943600" cy="8229600"/>
+            <wp:effectExtent b="0" l="0" r="0" t="0"/>
+            <wp:docPr descr="" title="" id="33" name="Picture"/>
+            <a:graphic>
+              <a:graphicData uri="http://schemas.openxmlformats.org/drawingml/2006/picture">
+                <pic:pic>
+                  <pic:nvPicPr>
+                    <pic:cNvPr descr="images/platform_dbl_04.png" id="34" name="Picture"/>
+                    <pic:cNvPicPr>
+                      <a:picLocks noChangeArrowheads="1" noChangeAspect="1"/>
+                    </pic:cNvPicPr>
+                  </pic:nvPicPr>
+                  <pic:blipFill>
+                    <a:blip r:embed="rId32"/>
+                    <a:stretch>
+                      <a:fillRect/>
+                    </a:stretch>
+                  </pic:blipFill>
+                  <pic:spPr bwMode="auto">
+                    <a:xfrm>
+                      <a:off x="0" y="0"/>
+                      <a:ext cx="5943600" cy="8229600"/>
+                    </a:xfrm>
+                    <a:prstGeom prst="rect">
+                      <a:avLst/>
+                    </a:prstGeom>
+                    <a:noFill/>
+                    <a:ln w="9525">
+                      <a:noFill/>
+                      <a:headEnd/>
+                      <a:tailEnd/>
+                    </a:ln>
+                  </pic:spPr>
+                </pic:pic>
+              </a:graphicData>
+            </a:graphic>
+          </wp:inline>
+        </w:drawing>
+      </w:r>
+    </w:p>
+    <w:bookmarkEnd w:id="35"/>
+    <w:bookmarkStart w:id="39" w:name="step-5"/>
     <w:p>
       <w:pPr>
         <w:pStyle w:val="Heading2"/>
       </w:pPr>
       <w:r>
-        <w:t xml:space="preserve">Step 3</w:t>
-      </w:r>
-    </w:p>
-    <w:p>
-      <w:pPr>
-        <w:pStyle w:val="Compact"/>
-        <w:numPr>
-          <w:ilvl w:val="0"/>
-          <w:numId w:val="1004"/>
-        </w:numPr>
-      </w:pPr>
-      <w:r>
-        <w:t xml:space="preserve">Put 3 nails in a vertical line on both ends of each joist</w:t>
+        <w:t xml:space="preserve">Step 5</w:t>
+      </w:r>
+    </w:p>
+    <w:p>
+      <w:pPr>
+        <w:numPr>
+          <w:ilvl w:val="0"/>
+          <w:numId w:val="1006"/>
+        </w:numPr>
+      </w:pPr>
+      <w:r>
+        <w:t xml:space="preserve">Put pre-cut skids into the steel building carriages</w:t>
       </w:r>
       <w:r>
         <w:br/>
       </w:r>
       <w:r>
-        <w:t xml:space="preserve">— make sure joists are flush before nailing; one person holds the joist in position</w:t>
+        <w:t xml:space="preserve">— longer part of the angled edges up</w:t>
+      </w:r>
+      <w:r>
+        <w:br/>
+      </w:r>
+      <w:r>
+        <w:t xml:space="preserve">— position each 4x6 skid so that the ink mark on the 4x6 is even</w:t>
       </w:r>
       <w:r>
         <w:t xml:space="preserve"> </w:t>
       </w:r>
       <w:r>
-        <w:t xml:space="preserve">while the second person nails.</w:t>
+        <w:t xml:space="preserve">with the front of the carriage. The end with the mark is at the front</w:t>
+      </w:r>
+      <w:r>
+        <w:t xml:space="preserve"> </w:t>
+      </w:r>
+      <w:r>
+        <w:t xml:space="preserve">of the home.</w:t>
+      </w:r>
+    </w:p>
+    <w:p>
+      <w:pPr>
+        <w:numPr>
+          <w:ilvl w:val="0"/>
+          <w:numId w:val="1006"/>
+        </w:numPr>
+      </w:pPr>
+      <w:r>
+        <w:t xml:space="preserve">Install the alignment jigs, first to the front of the skids, and then to the back.</w:t>
       </w:r>
       <w:r>
         <w:br/>
       </w:r>
       <w:r>
-        <w:t xml:space="preserve">— include two nails in the doubled joist ends</w:t>
-      </w:r>
-    </w:p>
-    <w:p>
-      <w:r>
-        <w:br w:type="page"/>
-      </w:r>
-    </w:p>
-    <w:tbl>
-      <w:tblPr>
-        <w:tblStyle w:val="Table"/>
-        <w:tblW w:type="pct" w:w="5000"/>
-        <w:tblLayout w:type="fixed"/>
-        <w:tblLook w:firstRow="0" w:lastRow="0" w:firstColumn="0" w:lastColumn="0" w:noHBand="0" w:noVBand="0" w:val="0000"/>
-      </w:tblPr>
-      <w:tblGrid>
-        <w:gridCol w:w="7920"/>
-      </w:tblGrid>
-      <w:tr>
-        <w:tc>
-          <w:tcPr/>
-          <w:bookmarkStart w:id="36" w:name="fig-539a35d47e664c97a50115a146a7f1bd-3"/>
-          <w:p>
-            <w:pPr>
-              <w:pStyle w:val="Compact"/>
-              <w:jc w:val="center"/>
-            </w:pPr>
-            <w:bookmarkStart w:id="35" w:name="fig-539a35d47e664c97a50115a146a7f1bd-3"/>
-            <w:r>
-              <w:drawing>
-                <wp:inline>
-                  <wp:extent cx="5943600" cy="8229600"/>
-                  <wp:effectExtent b="0" l="0" r="0" t="0"/>
-                  <wp:docPr descr=" " title="" id="33" name="Picture"/>
-                  <a:graphic>
-                    <a:graphicData uri="http://schemas.openxmlformats.org/drawingml/2006/picture">
-                      <pic:pic>
-                        <pic:nvPicPr>
-                          <pic:cNvPr descr="images/platform_dbl_03.png" id="34" name="Picture"/>
-                          <pic:cNvPicPr>
-                            <a:picLocks noChangeArrowheads="1" noChangeAspect="1"/>
-                          </pic:cNvPicPr>
-                        </pic:nvPicPr>
-                        <pic:blipFill>
-                          <a:blip r:embed="rId32"/>
-                          <a:stretch>
-                            <a:fillRect/>
-                          </a:stretch>
-                        </pic:blipFill>
-                        <pic:spPr bwMode="auto">
-                          <a:xfrm>
-                            <a:off x="0" y="0"/>
-                            <a:ext cx="5943600" cy="8229600"/>
-                          </a:xfrm>
-                          <a:prstGeom prst="rect">
-                            <a:avLst/>
-                          </a:prstGeom>
-                          <a:noFill/>
-                          <a:ln w="9525">
-                            <a:noFill/>
-                            <a:headEnd/>
-                            <a:tailEnd/>
-                          </a:ln>
-                        </pic:spPr>
-                      </pic:pic>
-                    </a:graphicData>
-                  </a:graphic>
-                </wp:inline>
-              </w:drawing>
-            </w:r>
-            <w:bookmarkEnd w:id="35"/>
-          </w:p>
-          <w:p>
-            <w:pPr>
-              <w:jc w:val="center"/>
-            </w:pPr>
-            <w:pPr>
-              <w:jc w:val="start"/>
-              <w:spacing w:before="200"/>
-              <w:pStyle w:val="ImageCaption"/>
-            </w:pPr>
-            <w:r>
-              <w:t xml:space="preserve"> </w:t>
-            </w:r>
-          </w:p>
-          <w:bookmarkEnd w:id="36"/>
-        </w:tc>
-      </w:tr>
-    </w:tbl>
-    <w:bookmarkEnd w:id="37"/>
-    <w:bookmarkStart w:id="43" w:name="step-4"/>
-    <w:p>
-      <w:pPr>
-        <w:pStyle w:val="Heading2"/>
-      </w:pPr>
-      <w:r>
-        <w:t xml:space="preserve">Step 4</w:t>
-      </w:r>
-    </w:p>
-    <w:p>
-      <w:pPr>
-        <w:numPr>
-          <w:ilvl w:val="0"/>
-          <w:numId w:val="1005"/>
-        </w:numPr>
-      </w:pPr>
-      <w:r>
-        <w:t xml:space="preserve">Remove the jenga blocks from outside the long sides of the frame.</w:t>
-      </w:r>
-    </w:p>
-    <w:p>
-      <w:pPr>
-        <w:numPr>
-          <w:ilvl w:val="0"/>
-          <w:numId w:val="1005"/>
-        </w:numPr>
-      </w:pPr>
-      <w:r>
-        <w:t xml:space="preserve">Position a long 2x6 outside each long side of the frame.</w:t>
-      </w:r>
-    </w:p>
-    <w:p>
-      <w:pPr>
-        <w:numPr>
-          <w:ilvl w:val="0"/>
-          <w:numId w:val="1005"/>
-        </w:numPr>
-      </w:pPr>
-      <w:r>
-        <w:t xml:space="preserve">Using clamps as necessary to align the two long boards, nail these</w:t>
+        <w:t xml:space="preserve">— At the front, the cross bar should stick up above the tops of the skids, and</w:t>
       </w:r>
       <w:r>
         <w:t xml:space="preserve"> </w:t>
       </w:r>
       <w:r>
-        <w:t xml:space="preserve">boards together, one nail in the middle of each bay (between the</w:t>
+        <w:t xml:space="preserve">the two alignment blocks should be flush with the skid tops</w:t>
+      </w:r>
+      <w:r>
+        <w:br/>
+      </w:r>
+      <w:r>
+        <w:t xml:space="preserve">— The skids should both be between the two alignment blocks</w:t>
+      </w:r>
+      <w:r>
+        <w:br/>
+      </w:r>
+      <w:r>
+        <w:t xml:space="preserve">— Block the wheels on one carriage, but leave the other one free to roll.</w:t>
+      </w:r>
+    </w:p>
+    <w:p>
+      <w:pPr>
+        <w:numPr>
+          <w:ilvl w:val="0"/>
+          <w:numId w:val="1006"/>
+        </w:numPr>
+      </w:pPr>
+      <w:r>
+        <w:t xml:space="preserve">Measure diagonally from jig corner to corner and adjust so that the jig is square.</w:t>
       </w:r>
       <w:r>
         <w:t xml:space="preserve"> </w:t>
       </w:r>
       <w:r>
-        <w:t xml:space="preserve">joists), centered vertically.</w:t>
-      </w:r>
-    </w:p>
-    <w:p>
-      <w:pPr>
-        <w:numPr>
-          <w:ilvl w:val="0"/>
-          <w:numId w:val="1005"/>
-        </w:numPr>
-      </w:pPr>
-      <w:r>
-        <w:t xml:space="preserve">Use a pry bar to lift the frame out of the jig and slip a jenga</w:t>
+        <w:t xml:space="preserve">When this is done, block the wheels on the second carriage.</w:t>
+      </w:r>
+    </w:p>
+    <w:p>
+      <w:pPr>
+        <w:numPr>
+          <w:ilvl w:val="0"/>
+          <w:numId w:val="1006"/>
+        </w:numPr>
+      </w:pPr>
+      <w:r>
+        <w:t xml:space="preserve">Pry the frame out of the jig, and lift the frame onto the pre-cut skids.</w:t>
+      </w:r>
+      <w:r>
+        <w:br/>
+      </w:r>
+      <w:r>
+        <w:t xml:space="preserve">— At the front, the frame should be up against the jig crossbar. At all</w:t>
       </w:r>
       <w:r>
         <w:t xml:space="preserve"> </w:t>
       </w:r>
       <w:r>
-        <w:t xml:space="preserve">block under the long boards in 3 places on each side</w:t>
-      </w:r>
-    </w:p>
-    <w:p>
-      <w:r>
-        <w:br w:type="page"/>
-      </w:r>
-    </w:p>
-    <w:tbl>
-      <w:tblPr>
-        <w:tblStyle w:val="Table"/>
-        <w:tblW w:type="pct" w:w="5000"/>
-        <w:tblLayout w:type="fixed"/>
-        <w:tblLook w:firstRow="0" w:lastRow="0" w:firstColumn="0" w:lastColumn="0" w:noHBand="0" w:noVBand="0" w:val="0000"/>
-      </w:tblPr>
-      <w:tblGrid>
-        <w:gridCol w:w="7920"/>
-      </w:tblGrid>
-      <w:tr>
-        <w:tc>
-          <w:tcPr/>
-          <w:bookmarkStart w:id="42" w:name="fig-539a35d47e664c97a50115a146a7f1bd-4"/>
-          <w:p>
-            <w:pPr>
-              <w:pStyle w:val="Compact"/>
-              <w:jc w:val="center"/>
-            </w:pPr>
-            <w:bookmarkStart w:id="41" w:name="fig-539a35d47e664c97a50115a146a7f1bd-4"/>
-            <w:r>
-              <w:drawing>
-                <wp:inline>
-                  <wp:extent cx="5943600" cy="7691717"/>
-                  <wp:effectExtent b="0" l="0" r="0" t="0"/>
-                  <wp:docPr descr=" " title="" id="39" name="Picture"/>
-                  <a:graphic>
-                    <a:graphicData uri="http://schemas.openxmlformats.org/drawingml/2006/picture">
-                      <pic:pic>
-                        <pic:nvPicPr>
-                          <pic:cNvPr descr="images/platform_dbl_04.png" id="40" name="Picture"/>
-                          <pic:cNvPicPr>
-                            <a:picLocks noChangeArrowheads="1" noChangeAspect="1"/>
-                          </pic:cNvPicPr>
-                        </pic:nvPicPr>
-                        <pic:blipFill>
-                          <a:blip r:embed="rId38"/>
-                          <a:stretch>
-                            <a:fillRect/>
-                          </a:stretch>
-                        </pic:blipFill>
-                        <pic:spPr bwMode="auto">
-                          <a:xfrm>
-                            <a:off x="0" y="0"/>
-                            <a:ext cx="5943600" cy="7691717"/>
-                          </a:xfrm>
-                          <a:prstGeom prst="rect">
-                            <a:avLst/>
-                          </a:prstGeom>
-                          <a:noFill/>
-                          <a:ln w="9525">
-                            <a:noFill/>
-                            <a:headEnd/>
-                            <a:tailEnd/>
-                          </a:ln>
-                        </pic:spPr>
-                      </pic:pic>
-                    </a:graphicData>
-                  </a:graphic>
-                </wp:inline>
-              </w:drawing>
-            </w:r>
-            <w:bookmarkEnd w:id="41"/>
-          </w:p>
-          <w:p>
-            <w:pPr>
-              <w:jc w:val="center"/>
-            </w:pPr>
-            <w:pPr>
-              <w:jc w:val="start"/>
-              <w:spacing w:before="200"/>
-              <w:pStyle w:val="ImageCaption"/>
-            </w:pPr>
-            <w:r>
-              <w:t xml:space="preserve"> </w:t>
-            </w:r>
-          </w:p>
-          <w:bookmarkEnd w:id="42"/>
-        </w:tc>
-      </w:tr>
-    </w:tbl>
-    <w:bookmarkEnd w:id="43"/>
-    <w:bookmarkStart w:id="49" w:name="step-5"/>
-    <w:p>
-      <w:pPr>
-        <w:pStyle w:val="Heading2"/>
-      </w:pPr>
-      <w:r>
-        <w:t xml:space="preserve">Step 5</w:t>
-      </w:r>
-    </w:p>
-    <w:p>
-      <w:pPr>
-        <w:numPr>
-          <w:ilvl w:val="0"/>
-          <w:numId w:val="1006"/>
-        </w:numPr>
-      </w:pPr>
-      <w:r>
-        <w:t xml:space="preserve">Put pre-cut skids into the steel building carriages</w:t>
+        <w:t xml:space="preserve">four corners, the frame should fit into the metal angles.</w:t>
       </w:r>
       <w:r>
         <w:br/>
-      </w:r>
-      <w:r>
-        <w:t xml:space="preserve">— longer part of the angled edges up</w:t>
-      </w:r>
-      <w:r>
-        <w:br/>
-      </w:r>
-      <w:r>
-        <w:t xml:space="preserve">— position each 4x6 skid so that the ink mark on the 4x6 is even</w:t>
-      </w:r>
-      <w:r>
-        <w:t xml:space="preserve"> </w:t>
-      </w:r>
-      <w:r>
-        <w:t xml:space="preserve">with the front of the carriage. The end with the mark is at the front</w:t>
-      </w:r>
-      <w:r>
-        <w:t xml:space="preserve"> </w:t>
-      </w:r>
-      <w:r>
-        <w:t xml:space="preserve">of the home.</w:t>
-      </w:r>
-    </w:p>
-    <w:p>
-      <w:pPr>
-        <w:numPr>
-          <w:ilvl w:val="0"/>
-          <w:numId w:val="1006"/>
-        </w:numPr>
-      </w:pPr>
-      <w:r>
-        <w:t xml:space="preserve">Install the alignment jigs, first to the front of the skids, and then to the back.</w:t>
-      </w:r>
-      <w:r>
-        <w:t xml:space="preserve"> </w:t>
-      </w:r>
-      <w:r>
-        <w:t xml:space="preserve">— At the front, the cross bar should stick up above the tops of the skids, and</w:t>
-      </w:r>
-      <w:r>
-        <w:t xml:space="preserve"> </w:t>
-      </w:r>
-      <w:r>
-        <w:t xml:space="preserve">the two alignment blocks should be flush with the skid tops</w:t>
-      </w:r>
-      <w:r>
-        <w:br/>
-      </w:r>
-      <w:r>
-        <w:t xml:space="preserve">— The skids should both be between the two alignment blocks</w:t>
-      </w:r>
-      <w:r>
-        <w:br/>
-      </w:r>
-      <w:r>
-        <w:t xml:space="preserve">— Block the wheels on one carriage, but leave the other one free to roll.</w:t>
-      </w:r>
-    </w:p>
-    <w:p>
-      <w:pPr>
-        <w:numPr>
-          <w:ilvl w:val="0"/>
-          <w:numId w:val="1006"/>
-        </w:numPr>
-      </w:pPr>
-      <w:r>
-        <w:t xml:space="preserve">Measure diagonally from jig corner to corner and adjust so that the jig is square.</w:t>
-      </w:r>
-      <w:r>
-        <w:t xml:space="preserve"> </w:t>
-      </w:r>
-      <w:r>
-        <w:t xml:space="preserve">When this is done, block the wheels on the second carriage.</w:t>
-      </w:r>
-    </w:p>
-    <w:p>
-      <w:pPr>
-        <w:numPr>
-          <w:ilvl w:val="0"/>
-          <w:numId w:val="1006"/>
-        </w:numPr>
-      </w:pPr>
-      <w:r>
-        <w:t xml:space="preserve">Pry the frame out of the jig, and lift the frame onto the pre-cut skids.</w:t>
-      </w:r>
-      <w:r>
-        <w:t xml:space="preserve"> </w:t>
-      </w:r>
-      <w:r>
-        <w:t xml:space="preserve">— At the front, the frame should be up against the jig crossbar. At all</w:t>
-      </w:r>
-      <w:r>
-        <w:t xml:space="preserve"> </w:t>
-      </w:r>
-      <w:r>
-        <w:t xml:space="preserve">four corners, the frame should fit into the metal angles.</w:t>
-      </w:r>
-      <w:r>
-        <w:t xml:space="preserve"> </w:t>
       </w:r>
       <w:r>
         <w:t xml:space="preserve">— Verify that the skids do not stick out beyond the back of the frame.</w:t>
@@ -981,89 +846,55 @@
         <w:br w:type="page"/>
       </w:r>
     </w:p>
-    <w:tbl>
-      <w:tblPr>
-        <w:tblStyle w:val="Table"/>
-        <w:tblW w:type="pct" w:w="5000"/>
-        <w:tblLayout w:type="fixed"/>
-        <w:tblLook w:firstRow="0" w:lastRow="0" w:firstColumn="0" w:lastColumn="0" w:noHBand="0" w:noVBand="0" w:val="0000"/>
-      </w:tblPr>
-      <w:tblGrid>
-        <w:gridCol w:w="7920"/>
-      </w:tblGrid>
-      <w:tr>
-        <w:tc>
-          <w:tcPr/>
-          <w:bookmarkStart w:id="48" w:name="fig-539a35d47e664c97a50115a146a7f1bd-5"/>
-          <w:p>
-            <w:pPr>
-              <w:pStyle w:val="Compact"/>
-              <w:jc w:val="center"/>
-            </w:pPr>
-            <w:bookmarkStart w:id="47" w:name="fig-539a35d47e664c97a50115a146a7f1bd-5"/>
-            <w:r>
-              <w:drawing>
-                <wp:inline>
-                  <wp:extent cx="5943600" cy="8229600"/>
-                  <wp:effectExtent b="0" l="0" r="0" t="0"/>
-                  <wp:docPr descr=" " title="" id="45" name="Picture"/>
-                  <a:graphic>
-                    <a:graphicData uri="http://schemas.openxmlformats.org/drawingml/2006/picture">
-                      <pic:pic>
-                        <pic:nvPicPr>
-                          <pic:cNvPr descr="images/platform_dbl_05.png" id="46" name="Picture"/>
-                          <pic:cNvPicPr>
-                            <a:picLocks noChangeArrowheads="1" noChangeAspect="1"/>
-                          </pic:cNvPicPr>
-                        </pic:nvPicPr>
-                        <pic:blipFill>
-                          <a:blip r:embed="rId44"/>
-                          <a:stretch>
-                            <a:fillRect/>
-                          </a:stretch>
-                        </pic:blipFill>
-                        <pic:spPr bwMode="auto">
-                          <a:xfrm>
-                            <a:off x="0" y="0"/>
-                            <a:ext cx="5943600" cy="8229600"/>
-                          </a:xfrm>
-                          <a:prstGeom prst="rect">
-                            <a:avLst/>
-                          </a:prstGeom>
-                          <a:noFill/>
-                          <a:ln w="9525">
-                            <a:noFill/>
-                            <a:headEnd/>
-                            <a:tailEnd/>
-                          </a:ln>
-                        </pic:spPr>
-                      </pic:pic>
-                    </a:graphicData>
-                  </a:graphic>
-                </wp:inline>
-              </w:drawing>
-            </w:r>
-            <w:bookmarkEnd w:id="47"/>
-          </w:p>
-          <w:p>
-            <w:pPr>
-              <w:jc w:val="center"/>
-            </w:pPr>
-            <w:pPr>
-              <w:jc w:val="start"/>
-              <w:spacing w:before="200"/>
-              <w:pStyle w:val="ImageCaption"/>
-            </w:pPr>
-            <w:r>
-              <w:t xml:space="preserve"> </w:t>
-            </w:r>
-          </w:p>
-          <w:bookmarkEnd w:id="48"/>
-        </w:tc>
-      </w:tr>
-    </w:tbl>
-    <w:bookmarkEnd w:id="49"/>
-    <w:bookmarkStart w:id="55" w:name="step-6"/>
+    <w:p>
+      <w:pPr>
+        <w:pStyle w:val="FirstParagraph"/>
+      </w:pPr>
+      <w:r>
+        <w:drawing>
+          <wp:inline>
+            <wp:extent cx="5943600" cy="8229600"/>
+            <wp:effectExtent b="0" l="0" r="0" t="0"/>
+            <wp:docPr descr="" title="" id="37" name="Picture"/>
+            <a:graphic>
+              <a:graphicData uri="http://schemas.openxmlformats.org/drawingml/2006/picture">
+                <pic:pic>
+                  <pic:nvPicPr>
+                    <pic:cNvPr descr="images/platform_dbl_05.png" id="38" name="Picture"/>
+                    <pic:cNvPicPr>
+                      <a:picLocks noChangeArrowheads="1" noChangeAspect="1"/>
+                    </pic:cNvPicPr>
+                  </pic:nvPicPr>
+                  <pic:blipFill>
+                    <a:blip r:embed="rId36"/>
+                    <a:stretch>
+                      <a:fillRect/>
+                    </a:stretch>
+                  </pic:blipFill>
+                  <pic:spPr bwMode="auto">
+                    <a:xfrm>
+                      <a:off x="0" y="0"/>
+                      <a:ext cx="5943600" cy="8229600"/>
+                    </a:xfrm>
+                    <a:prstGeom prst="rect">
+                      <a:avLst/>
+                    </a:prstGeom>
+                    <a:noFill/>
+                    <a:ln w="9525">
+                      <a:noFill/>
+                      <a:headEnd/>
+                      <a:tailEnd/>
+                    </a:ln>
+                  </pic:spPr>
+                </pic:pic>
+              </a:graphicData>
+            </a:graphic>
+          </wp:inline>
+        </w:drawing>
+      </w:r>
+    </w:p>
+    <w:bookmarkEnd w:id="39"/>
+    <w:bookmarkStart w:id="43" w:name="step-6"/>
     <w:p>
       <w:pPr>
         <w:pStyle w:val="Heading2"/>
@@ -1125,89 +956,55 @@
         <w:br w:type="page"/>
       </w:r>
     </w:p>
-    <w:tbl>
-      <w:tblPr>
-        <w:tblStyle w:val="Table"/>
-        <w:tblW w:type="pct" w:w="5000"/>
-        <w:tblLayout w:type="fixed"/>
-        <w:tblLook w:firstRow="0" w:lastRow="0" w:firstColumn="0" w:lastColumn="0" w:noHBand="0" w:noVBand="0" w:val="0000"/>
-      </w:tblPr>
-      <w:tblGrid>
-        <w:gridCol w:w="7920"/>
-      </w:tblGrid>
-      <w:tr>
-        <w:tc>
-          <w:tcPr/>
-          <w:bookmarkStart w:id="54" w:name="fig-539a35d47e664c97a50115a146a7f1bd-6"/>
-          <w:p>
-            <w:pPr>
-              <w:pStyle w:val="Compact"/>
-              <w:jc w:val="center"/>
-            </w:pPr>
-            <w:bookmarkStart w:id="53" w:name="fig-539a35d47e664c97a50115a146a7f1bd-6"/>
-            <w:r>
-              <w:drawing>
-                <wp:inline>
-                  <wp:extent cx="5943600" cy="8229600"/>
-                  <wp:effectExtent b="0" l="0" r="0" t="0"/>
-                  <wp:docPr descr=" " title="" id="51" name="Picture"/>
-                  <a:graphic>
-                    <a:graphicData uri="http://schemas.openxmlformats.org/drawingml/2006/picture">
-                      <pic:pic>
-                        <pic:nvPicPr>
-                          <pic:cNvPr descr="images/platform_dbl_06.png" id="52" name="Picture"/>
-                          <pic:cNvPicPr>
-                            <a:picLocks noChangeArrowheads="1" noChangeAspect="1"/>
-                          </pic:cNvPicPr>
-                        </pic:nvPicPr>
-                        <pic:blipFill>
-                          <a:blip r:embed="rId50"/>
-                          <a:stretch>
-                            <a:fillRect/>
-                          </a:stretch>
-                        </pic:blipFill>
-                        <pic:spPr bwMode="auto">
-                          <a:xfrm>
-                            <a:off x="0" y="0"/>
-                            <a:ext cx="5943600" cy="8229600"/>
-                          </a:xfrm>
-                          <a:prstGeom prst="rect">
-                            <a:avLst/>
-                          </a:prstGeom>
-                          <a:noFill/>
-                          <a:ln w="9525">
-                            <a:noFill/>
-                            <a:headEnd/>
-                            <a:tailEnd/>
-                          </a:ln>
-                        </pic:spPr>
-                      </pic:pic>
-                    </a:graphicData>
-                  </a:graphic>
-                </wp:inline>
-              </w:drawing>
-            </w:r>
-            <w:bookmarkEnd w:id="53"/>
-          </w:p>
-          <w:p>
-            <w:pPr>
-              <w:jc w:val="center"/>
-            </w:pPr>
-            <w:pPr>
-              <w:jc w:val="start"/>
-              <w:spacing w:before="200"/>
-              <w:pStyle w:val="ImageCaption"/>
-            </w:pPr>
-            <w:r>
-              <w:t xml:space="preserve"> </w:t>
-            </w:r>
-          </w:p>
-          <w:bookmarkEnd w:id="54"/>
-        </w:tc>
-      </w:tr>
-    </w:tbl>
-    <w:bookmarkEnd w:id="55"/>
-    <w:bookmarkStart w:id="61" w:name="step-7"/>
+    <w:p>
+      <w:pPr>
+        <w:pStyle w:val="FirstParagraph"/>
+      </w:pPr>
+      <w:r>
+        <w:drawing>
+          <wp:inline>
+            <wp:extent cx="5943600" cy="8229600"/>
+            <wp:effectExtent b="0" l="0" r="0" t="0"/>
+            <wp:docPr descr="" title="" id="41" name="Picture"/>
+            <a:graphic>
+              <a:graphicData uri="http://schemas.openxmlformats.org/drawingml/2006/picture">
+                <pic:pic>
+                  <pic:nvPicPr>
+                    <pic:cNvPr descr="images/platform_dbl_06.png" id="42" name="Picture"/>
+                    <pic:cNvPicPr>
+                      <a:picLocks noChangeArrowheads="1" noChangeAspect="1"/>
+                    </pic:cNvPicPr>
+                  </pic:nvPicPr>
+                  <pic:blipFill>
+                    <a:blip r:embed="rId40"/>
+                    <a:stretch>
+                      <a:fillRect/>
+                    </a:stretch>
+                  </pic:blipFill>
+                  <pic:spPr bwMode="auto">
+                    <a:xfrm>
+                      <a:off x="0" y="0"/>
+                      <a:ext cx="5943600" cy="8229600"/>
+                    </a:xfrm>
+                    <a:prstGeom prst="rect">
+                      <a:avLst/>
+                    </a:prstGeom>
+                    <a:noFill/>
+                    <a:ln w="9525">
+                      <a:noFill/>
+                      <a:headEnd/>
+                      <a:tailEnd/>
+                    </a:ln>
+                  </pic:spPr>
+                </pic:pic>
+              </a:graphicData>
+            </a:graphic>
+          </wp:inline>
+        </w:drawing>
+      </w:r>
+    </w:p>
+    <w:bookmarkEnd w:id="43"/>
+    <w:bookmarkStart w:id="47" w:name="step-7"/>
     <w:p>
       <w:pPr>
         <w:pStyle w:val="Heading2"/>
@@ -1228,16 +1025,132 @@
         <w:t xml:space="preserve">At each X, screw in a metal bracket</w:t>
       </w:r>
       <w:r>
+        <w:br/>
+      </w:r>
+      <w:r>
+        <w:t xml:space="preserve">— use 6 small hexagonal screws for each metal bracket</w:t>
+      </w:r>
+      <w:r>
+        <w:br/>
+      </w:r>
+      <w:r>
+        <w:t xml:space="preserve">—3 on the bottom 3 on the top, attaching the frame to the skids</w:t>
+      </w:r>
+    </w:p>
+    <w:p>
+      <w:r>
+        <w:br w:type="page"/>
+      </w:r>
+    </w:p>
+    <w:p>
+      <w:pPr>
+        <w:pStyle w:val="FirstParagraph"/>
+      </w:pPr>
+      <w:r>
+        <w:drawing>
+          <wp:inline>
+            <wp:extent cx="5943600" cy="8229600"/>
+            <wp:effectExtent b="0" l="0" r="0" t="0"/>
+            <wp:docPr descr="" title="" id="45" name="Picture"/>
+            <a:graphic>
+              <a:graphicData uri="http://schemas.openxmlformats.org/drawingml/2006/picture">
+                <pic:pic>
+                  <pic:nvPicPr>
+                    <pic:cNvPr descr="images/platform_dbl_07.png" id="46" name="Picture"/>
+                    <pic:cNvPicPr>
+                      <a:picLocks noChangeArrowheads="1" noChangeAspect="1"/>
+                    </pic:cNvPicPr>
+                  </pic:nvPicPr>
+                  <pic:blipFill>
+                    <a:blip r:embed="rId44"/>
+                    <a:stretch>
+                      <a:fillRect/>
+                    </a:stretch>
+                  </pic:blipFill>
+                  <pic:spPr bwMode="auto">
+                    <a:xfrm>
+                      <a:off x="0" y="0"/>
+                      <a:ext cx="5943600" cy="8229600"/>
+                    </a:xfrm>
+                    <a:prstGeom prst="rect">
+                      <a:avLst/>
+                    </a:prstGeom>
+                    <a:noFill/>
+                    <a:ln w="9525">
+                      <a:noFill/>
+                      <a:headEnd/>
+                      <a:tailEnd/>
+                    </a:ln>
+                  </pic:spPr>
+                </pic:pic>
+              </a:graphicData>
+            </a:graphic>
+          </wp:inline>
+        </w:drawing>
+      </w:r>
+    </w:p>
+    <w:bookmarkEnd w:id="47"/>
+    <w:bookmarkStart w:id="51" w:name="step-8"/>
+    <w:p>
+      <w:pPr>
+        <w:pStyle w:val="Heading2"/>
+      </w:pPr>
+      <w:r>
+        <w:t xml:space="preserve">Step 8</w:t>
+      </w:r>
+    </w:p>
+    <w:p>
+      <w:pPr>
+        <w:pStyle w:val="Compact"/>
+        <w:numPr>
+          <w:ilvl w:val="0"/>
+          <w:numId w:val="1009"/>
+        </w:numPr>
+      </w:pPr>
+      <w:r>
+        <w:t xml:space="preserve">Place blocks labeled</w:t>
+      </w:r>
+      <w:r>
         <w:t xml:space="preserve"> </w:t>
       </w:r>
       <w:r>
-        <w:t xml:space="preserve">— use 6 small hexagonal screws for each metal bracket</w:t>
+        <w:t xml:space="preserve">“SAVE”</w:t>
+      </w:r>
+      <w:r>
+        <w:t xml:space="preserve"> </w:t>
+      </w:r>
+      <w:r>
+        <w:t xml:space="preserve">in each bay, except the front and back bays</w:t>
       </w:r>
       <w:r>
         <w:br/>
       </w:r>
       <w:r>
-        <w:t xml:space="preserve">—3 on the bottom 3 on the top, attaching the frame to the skids</w:t>
+        <w:t xml:space="preserve">— on top of each skid, centered between the joists.</w:t>
+      </w:r>
+      <w:r>
+        <w:br/>
+      </w:r>
+      <w:r>
+        <w:t xml:space="preserve">— DO NOT NAIL</w:t>
+      </w:r>
+      <w:r>
+        <w:br/>
+      </w:r>
+      <w:r>
+        <w:t xml:space="preserve">— At each end, place the</w:t>
+      </w:r>
+      <w:r>
+        <w:t xml:space="preserve"> </w:t>
+      </w:r>
+      <w:r>
+        <w:t xml:space="preserve">“SAVE END”</w:t>
+      </w:r>
+      <w:r>
+        <w:t xml:space="preserve"> </w:t>
+      </w:r>
+      <w:r>
+        <w:t xml:space="preserve">blocks.</w:t>
       </w:r>
     </w:p>
     <w:p>
@@ -1245,239 +1158,55 @@
         <w:br w:type="page"/>
       </w:r>
     </w:p>
-    <w:tbl>
-      <w:tblPr>
-        <w:tblStyle w:val="Table"/>
-        <w:tblW w:type="pct" w:w="5000"/>
-        <w:tblLayout w:type="fixed"/>
-        <w:tblLook w:firstRow="0" w:lastRow="0" w:firstColumn="0" w:lastColumn="0" w:noHBand="0" w:noVBand="0" w:val="0000"/>
-      </w:tblPr>
-      <w:tblGrid>
-        <w:gridCol w:w="7920"/>
-      </w:tblGrid>
-      <w:tr>
-        <w:tc>
-          <w:tcPr/>
-          <w:bookmarkStart w:id="60" w:name="fig-539a35d47e664c97a50115a146a7f1bd-7"/>
-          <w:p>
-            <w:pPr>
-              <w:pStyle w:val="Compact"/>
-              <w:jc w:val="center"/>
-            </w:pPr>
-            <w:bookmarkStart w:id="59" w:name="fig-539a35d47e664c97a50115a146a7f1bd-7"/>
-            <w:r>
-              <w:drawing>
-                <wp:inline>
-                  <wp:extent cx="5943600" cy="8229600"/>
-                  <wp:effectExtent b="0" l="0" r="0" t="0"/>
-                  <wp:docPr descr=" " title="" id="57" name="Picture"/>
-                  <a:graphic>
-                    <a:graphicData uri="http://schemas.openxmlformats.org/drawingml/2006/picture">
-                      <pic:pic>
-                        <pic:nvPicPr>
-                          <pic:cNvPr descr="images/platform_dbl_07.png" id="58" name="Picture"/>
-                          <pic:cNvPicPr>
-                            <a:picLocks noChangeArrowheads="1" noChangeAspect="1"/>
-                          </pic:cNvPicPr>
-                        </pic:nvPicPr>
-                        <pic:blipFill>
-                          <a:blip r:embed="rId56"/>
-                          <a:stretch>
-                            <a:fillRect/>
-                          </a:stretch>
-                        </pic:blipFill>
-                        <pic:spPr bwMode="auto">
-                          <a:xfrm>
-                            <a:off x="0" y="0"/>
-                            <a:ext cx="5943600" cy="8229600"/>
-                          </a:xfrm>
-                          <a:prstGeom prst="rect">
-                            <a:avLst/>
-                          </a:prstGeom>
-                          <a:noFill/>
-                          <a:ln w="9525">
-                            <a:noFill/>
-                            <a:headEnd/>
-                            <a:tailEnd/>
-                          </a:ln>
-                        </pic:spPr>
-                      </pic:pic>
-                    </a:graphicData>
-                  </a:graphic>
-                </wp:inline>
-              </w:drawing>
-            </w:r>
-            <w:bookmarkEnd w:id="59"/>
-          </w:p>
-          <w:p>
-            <w:pPr>
-              <w:jc w:val="center"/>
-            </w:pPr>
-            <w:pPr>
-              <w:jc w:val="start"/>
-              <w:spacing w:before="200"/>
-              <w:pStyle w:val="ImageCaption"/>
-            </w:pPr>
-            <w:r>
-              <w:t xml:space="preserve"> </w:t>
-            </w:r>
-          </w:p>
-          <w:bookmarkEnd w:id="60"/>
-        </w:tc>
-      </w:tr>
-    </w:tbl>
-    <w:bookmarkEnd w:id="61"/>
-    <w:bookmarkStart w:id="67" w:name="step-8"/>
-    <w:p>
-      <w:pPr>
-        <w:pStyle w:val="Heading2"/>
-      </w:pPr>
-      <w:r>
-        <w:t xml:space="preserve">Step 8</w:t>
-      </w:r>
-    </w:p>
-    <w:p>
-      <w:pPr>
-        <w:pStyle w:val="Compact"/>
-        <w:numPr>
-          <w:ilvl w:val="0"/>
-          <w:numId w:val="1009"/>
-        </w:numPr>
-      </w:pPr>
-      <w:r>
-        <w:t xml:space="preserve">Place blocks labeled</w:t>
-      </w:r>
-      <w:r>
-        <w:t xml:space="preserve"> </w:t>
-      </w:r>
-      <w:r>
-        <w:t xml:space="preserve">“SAVE”</w:t>
-      </w:r>
-      <w:r>
-        <w:t xml:space="preserve"> </w:t>
-      </w:r>
-      <w:r>
-        <w:t xml:space="preserve">in each bay, except the front and back bays</w:t>
-      </w:r>
-      <w:r>
-        <w:br/>
-      </w:r>
-      <w:r>
-        <w:t xml:space="preserve">— on top of each skid, centered between the joists.</w:t>
-      </w:r>
-      <w:r>
-        <w:br/>
-      </w:r>
-      <w:r>
-        <w:t xml:space="preserve">— DO NOT NAIL</w:t>
-      </w:r>
-      <w:r>
-        <w:t xml:space="preserve"> </w:t>
-      </w:r>
-      <w:r>
-        <w:t xml:space="preserve">— At each end, place the</w:t>
-      </w:r>
-      <w:r>
-        <w:t xml:space="preserve"> </w:t>
-      </w:r>
-      <w:r>
-        <w:t xml:space="preserve">“SAVE END”</w:t>
-      </w:r>
-      <w:r>
-        <w:t xml:space="preserve"> </w:t>
-      </w:r>
-      <w:r>
-        <w:t xml:space="preserve">blocks.</w:t>
-      </w:r>
-    </w:p>
-    <w:p>
-      <w:r>
-        <w:br w:type="page"/>
-      </w:r>
-    </w:p>
-    <w:tbl>
-      <w:tblPr>
-        <w:tblStyle w:val="Table"/>
-        <w:tblW w:type="pct" w:w="5000"/>
-        <w:tblLayout w:type="fixed"/>
-        <w:tblLook w:firstRow="0" w:lastRow="0" w:firstColumn="0" w:lastColumn="0" w:noHBand="0" w:noVBand="0" w:val="0000"/>
-      </w:tblPr>
-      <w:tblGrid>
-        <w:gridCol w:w="7920"/>
-      </w:tblGrid>
-      <w:tr>
-        <w:tc>
-          <w:tcPr/>
-          <w:bookmarkStart w:id="66" w:name="fig-539a35d47e664c97a50115a146a7f1bd-8"/>
-          <w:p>
-            <w:pPr>
-              <w:pStyle w:val="Compact"/>
-              <w:jc w:val="center"/>
-            </w:pPr>
-            <w:bookmarkStart w:id="65" w:name="fig-539a35d47e664c97a50115a146a7f1bd-8"/>
-            <w:r>
-              <w:drawing>
-                <wp:inline>
-                  <wp:extent cx="5943600" cy="8229600"/>
-                  <wp:effectExtent b="0" l="0" r="0" t="0"/>
-                  <wp:docPr descr=" " title="" id="63" name="Picture"/>
-                  <a:graphic>
-                    <a:graphicData uri="http://schemas.openxmlformats.org/drawingml/2006/picture">
-                      <pic:pic>
-                        <pic:nvPicPr>
-                          <pic:cNvPr descr="images/platform_dbl_08.png" id="64" name="Picture"/>
-                          <pic:cNvPicPr>
-                            <a:picLocks noChangeArrowheads="1" noChangeAspect="1"/>
-                          </pic:cNvPicPr>
-                        </pic:nvPicPr>
-                        <pic:blipFill>
-                          <a:blip r:embed="rId62"/>
-                          <a:stretch>
-                            <a:fillRect/>
-                          </a:stretch>
-                        </pic:blipFill>
-                        <pic:spPr bwMode="auto">
-                          <a:xfrm>
-                            <a:off x="0" y="0"/>
-                            <a:ext cx="5943600" cy="8229600"/>
-                          </a:xfrm>
-                          <a:prstGeom prst="rect">
-                            <a:avLst/>
-                          </a:prstGeom>
-                          <a:noFill/>
-                          <a:ln w="9525">
-                            <a:noFill/>
-                            <a:headEnd/>
-                            <a:tailEnd/>
-                          </a:ln>
-                        </pic:spPr>
-                      </pic:pic>
-                    </a:graphicData>
-                  </a:graphic>
-                </wp:inline>
-              </w:drawing>
-            </w:r>
-            <w:bookmarkEnd w:id="65"/>
-          </w:p>
-          <w:p>
-            <w:pPr>
-              <w:jc w:val="center"/>
-            </w:pPr>
-            <w:pPr>
-              <w:jc w:val="start"/>
-              <w:spacing w:before="200"/>
-              <w:pStyle w:val="ImageCaption"/>
-            </w:pPr>
-            <w:r>
-              <w:t xml:space="preserve"> </w:t>
-            </w:r>
-          </w:p>
-          <w:bookmarkEnd w:id="66"/>
-        </w:tc>
-      </w:tr>
-    </w:tbl>
-    <w:bookmarkEnd w:id="67"/>
-    <w:bookmarkStart w:id="73" w:name="step-9"/>
+    <w:p>
+      <w:pPr>
+        <w:pStyle w:val="FirstParagraph"/>
+      </w:pPr>
+      <w:r>
+        <w:drawing>
+          <wp:inline>
+            <wp:extent cx="5943600" cy="8229600"/>
+            <wp:effectExtent b="0" l="0" r="0" t="0"/>
+            <wp:docPr descr="" title="" id="49" name="Picture"/>
+            <a:graphic>
+              <a:graphicData uri="http://schemas.openxmlformats.org/drawingml/2006/picture">
+                <pic:pic>
+                  <pic:nvPicPr>
+                    <pic:cNvPr descr="images/platform_dbl_08.png" id="50" name="Picture"/>
+                    <pic:cNvPicPr>
+                      <a:picLocks noChangeArrowheads="1" noChangeAspect="1"/>
+                    </pic:cNvPicPr>
+                  </pic:nvPicPr>
+                  <pic:blipFill>
+                    <a:blip r:embed="rId48"/>
+                    <a:stretch>
+                      <a:fillRect/>
+                    </a:stretch>
+                  </pic:blipFill>
+                  <pic:spPr bwMode="auto">
+                    <a:xfrm>
+                      <a:off x="0" y="0"/>
+                      <a:ext cx="5943600" cy="8229600"/>
+                    </a:xfrm>
+                    <a:prstGeom prst="rect">
+                      <a:avLst/>
+                    </a:prstGeom>
+                    <a:noFill/>
+                    <a:ln w="9525">
+                      <a:noFill/>
+                      <a:headEnd/>
+                      <a:tailEnd/>
+                    </a:ln>
+                  </pic:spPr>
+                </pic:pic>
+              </a:graphicData>
+            </a:graphic>
+          </wp:inline>
+        </w:drawing>
+      </w:r>
+    </w:p>
+    <w:bookmarkEnd w:id="51"/>
+    <w:bookmarkStart w:id="55" w:name="step-9"/>
     <w:p>
       <w:pPr>
         <w:pStyle w:val="Heading2"/>
@@ -1625,89 +1354,55 @@
         <w:br w:type="page"/>
       </w:r>
     </w:p>
-    <w:tbl>
-      <w:tblPr>
-        <w:tblStyle w:val="Table"/>
-        <w:tblW w:type="pct" w:w="5000"/>
-        <w:tblLayout w:type="fixed"/>
-        <w:tblLook w:firstRow="0" w:lastRow="0" w:firstColumn="0" w:lastColumn="0" w:noHBand="0" w:noVBand="0" w:val="0000"/>
-      </w:tblPr>
-      <w:tblGrid>
-        <w:gridCol w:w="7920"/>
-      </w:tblGrid>
-      <w:tr>
-        <w:tc>
-          <w:tcPr/>
-          <w:bookmarkStart w:id="72" w:name="fig-539a35d47e664c97a50115a146a7f1bd-9"/>
-          <w:p>
-            <w:pPr>
-              <w:pStyle w:val="Compact"/>
-              <w:jc w:val="center"/>
-            </w:pPr>
-            <w:bookmarkStart w:id="71" w:name="fig-539a35d47e664c97a50115a146a7f1bd-9"/>
-            <w:r>
-              <w:drawing>
-                <wp:inline>
-                  <wp:extent cx="5943600" cy="8229600"/>
-                  <wp:effectExtent b="0" l="0" r="0" t="0"/>
-                  <wp:docPr descr=" " title="" id="69" name="Picture"/>
-                  <a:graphic>
-                    <a:graphicData uri="http://schemas.openxmlformats.org/drawingml/2006/picture">
-                      <pic:pic>
-                        <pic:nvPicPr>
-                          <pic:cNvPr descr="images/platform_dbl_09.png" id="70" name="Picture"/>
-                          <pic:cNvPicPr>
-                            <a:picLocks noChangeArrowheads="1" noChangeAspect="1"/>
-                          </pic:cNvPicPr>
-                        </pic:nvPicPr>
-                        <pic:blipFill>
-                          <a:blip r:embed="rId68"/>
-                          <a:stretch>
-                            <a:fillRect/>
-                          </a:stretch>
-                        </pic:blipFill>
-                        <pic:spPr bwMode="auto">
-                          <a:xfrm>
-                            <a:off x="0" y="0"/>
-                            <a:ext cx="5943600" cy="8229600"/>
-                          </a:xfrm>
-                          <a:prstGeom prst="rect">
-                            <a:avLst/>
-                          </a:prstGeom>
-                          <a:noFill/>
-                          <a:ln w="9525">
-                            <a:noFill/>
-                            <a:headEnd/>
-                            <a:tailEnd/>
-                          </a:ln>
-                        </pic:spPr>
-                      </pic:pic>
-                    </a:graphicData>
-                  </a:graphic>
-                </wp:inline>
-              </w:drawing>
-            </w:r>
-            <w:bookmarkEnd w:id="71"/>
-          </w:p>
-          <w:p>
-            <w:pPr>
-              <w:jc w:val="center"/>
-            </w:pPr>
-            <w:pPr>
-              <w:jc w:val="start"/>
-              <w:spacing w:before="200"/>
-              <w:pStyle w:val="ImageCaption"/>
-            </w:pPr>
-            <w:r>
-              <w:t xml:space="preserve"> </w:t>
-            </w:r>
-          </w:p>
-          <w:bookmarkEnd w:id="72"/>
-        </w:tc>
-      </w:tr>
-    </w:tbl>
-    <w:bookmarkEnd w:id="73"/>
-    <w:bookmarkStart w:id="79" w:name="step-10"/>
+    <w:p>
+      <w:pPr>
+        <w:pStyle w:val="FirstParagraph"/>
+      </w:pPr>
+      <w:r>
+        <w:drawing>
+          <wp:inline>
+            <wp:extent cx="5943600" cy="8229600"/>
+            <wp:effectExtent b="0" l="0" r="0" t="0"/>
+            <wp:docPr descr="" title="" id="53" name="Picture"/>
+            <a:graphic>
+              <a:graphicData uri="http://schemas.openxmlformats.org/drawingml/2006/picture">
+                <pic:pic>
+                  <pic:nvPicPr>
+                    <pic:cNvPr descr="images/platform_dbl_09.png" id="54" name="Picture"/>
+                    <pic:cNvPicPr>
+                      <a:picLocks noChangeArrowheads="1" noChangeAspect="1"/>
+                    </pic:cNvPicPr>
+                  </pic:nvPicPr>
+                  <pic:blipFill>
+                    <a:blip r:embed="rId52"/>
+                    <a:stretch>
+                      <a:fillRect/>
+                    </a:stretch>
+                  </pic:blipFill>
+                  <pic:spPr bwMode="auto">
+                    <a:xfrm>
+                      <a:off x="0" y="0"/>
+                      <a:ext cx="5943600" cy="8229600"/>
+                    </a:xfrm>
+                    <a:prstGeom prst="rect">
+                      <a:avLst/>
+                    </a:prstGeom>
+                    <a:noFill/>
+                    <a:ln w="9525">
+                      <a:noFill/>
+                      <a:headEnd/>
+                      <a:tailEnd/>
+                    </a:ln>
+                  </pic:spPr>
+                </pic:pic>
+              </a:graphicData>
+            </a:graphic>
+          </wp:inline>
+        </w:drawing>
+      </w:r>
+    </w:p>
+    <w:bookmarkEnd w:id="55"/>
+    <w:bookmarkStart w:id="59" w:name="step-10"/>
     <w:p>
       <w:pPr>
         <w:pStyle w:val="Heading2"/>
@@ -1780,143 +1475,111 @@
     </w:p>
     <w:p>
       <w:pPr>
+        <w:numPr>
+          <w:ilvl w:val="0"/>
+          <w:numId w:val="1011"/>
+        </w:numPr>
+      </w:pPr>
+      <w:r>
+        <w:t xml:space="preserve">Put a chalk line at the intermediate joists</w:t>
+      </w:r>
+      <w:r>
+        <w:br/>
+      </w:r>
+      <w:r>
+        <w:t xml:space="preserve">— get up on platform and closely straddle the chalk line (joist) to push the plywood board down while nailing</w:t>
+      </w:r>
+      <w:r>
+        <w:br/>
+      </w:r>
+      <w:r>
+        <w:t xml:space="preserve">— walk backwards while nailing 8 inches apart.</w:t>
+      </w:r>
+    </w:p>
+    <w:p>
+      <w:pPr>
+        <w:numPr>
+          <w:ilvl w:val="0"/>
+          <w:numId w:val="1011"/>
+        </w:numPr>
+      </w:pPr>
+      <w:r>
+        <w:t xml:space="preserve">Nail along all chalk lines in a pattern going diagonally towards the</w:t>
+      </w:r>
+      <w:r>
+        <w:t xml:space="preserve"> </w:t>
+      </w:r>
+      <w:r>
+        <w:t xml:space="preserve">opposite corner from where you started</w:t>
+      </w:r>
+    </w:p>
+    <w:p>
+      <w:r>
+        <w:br w:type="page"/>
+      </w:r>
+    </w:p>
+    <w:p>
+      <w:pPr>
         <w:pStyle w:val="FirstParagraph"/>
       </w:pPr>
       <w:r>
-        <w:t xml:space="preserve">-Put a chalk line at the intermediate joists</w:t>
-      </w:r>
-      <w:r>
-        <w:br/>
-      </w:r>
-      <w:r>
-        <w:t xml:space="preserve">— get up on platform and closely straddle the chalk line (joist) to push the plywood board down while nailing</w:t>
-      </w:r>
-      <w:r>
-        <w:br/>
-      </w:r>
-      <w:r>
-        <w:t xml:space="preserve">— walk backwards while nailing 8 inches apart.</w:t>
-      </w:r>
-    </w:p>
-    <w:p>
-      <w:pPr>
-        <w:pStyle w:val="Compact"/>
+        <w:drawing>
+          <wp:inline>
+            <wp:extent cx="5943600" cy="8229600"/>
+            <wp:effectExtent b="0" l="0" r="0" t="0"/>
+            <wp:docPr descr="" title="" id="57" name="Picture"/>
+            <a:graphic>
+              <a:graphicData uri="http://schemas.openxmlformats.org/drawingml/2006/picture">
+                <pic:pic>
+                  <pic:nvPicPr>
+                    <pic:cNvPr descr="images/platform_dbl_10.png" id="58" name="Picture"/>
+                    <pic:cNvPicPr>
+                      <a:picLocks noChangeArrowheads="1" noChangeAspect="1"/>
+                    </pic:cNvPicPr>
+                  </pic:nvPicPr>
+                  <pic:blipFill>
+                    <a:blip r:embed="rId56"/>
+                    <a:stretch>
+                      <a:fillRect/>
+                    </a:stretch>
+                  </pic:blipFill>
+                  <pic:spPr bwMode="auto">
+                    <a:xfrm>
+                      <a:off x="0" y="0"/>
+                      <a:ext cx="5943600" cy="8229600"/>
+                    </a:xfrm>
+                    <a:prstGeom prst="rect">
+                      <a:avLst/>
+                    </a:prstGeom>
+                    <a:noFill/>
+                    <a:ln w="9525">
+                      <a:noFill/>
+                      <a:headEnd/>
+                      <a:tailEnd/>
+                    </a:ln>
+                  </pic:spPr>
+                </pic:pic>
+              </a:graphicData>
+            </a:graphic>
+          </wp:inline>
+        </w:drawing>
+      </w:r>
+    </w:p>
+    <w:bookmarkEnd w:id="59"/>
+    <w:bookmarkStart w:id="63" w:name="step-11"/>
+    <w:p>
+      <w:pPr>
+        <w:pStyle w:val="Heading2"/>
+      </w:pPr>
+      <w:r>
+        <w:t xml:space="preserve">Step 11</w:t>
+      </w:r>
+    </w:p>
+    <w:p>
+      <w:pPr>
         <w:numPr>
           <w:ilvl w:val="0"/>
           <w:numId w:val="1012"/>
-        </w:numPr>
-      </w:pPr>
-      <w:r>
-        <w:t xml:space="preserve">Nail along all chalk lines in a pattern going diagonally towards the</w:t>
-      </w:r>
-      <w:r>
-        <w:t xml:space="preserve"> </w:t>
-      </w:r>
-      <w:r>
-        <w:t xml:space="preserve">opposite corner from where you started</w:t>
-      </w:r>
-    </w:p>
-    <w:p>
-      <w:r>
-        <w:br w:type="page"/>
-      </w:r>
-    </w:p>
-    <w:tbl>
-      <w:tblPr>
-        <w:tblStyle w:val="Table"/>
-        <w:tblW w:type="pct" w:w="5000"/>
-        <w:tblLayout w:type="fixed"/>
-        <w:tblLook w:firstRow="0" w:lastRow="0" w:firstColumn="0" w:lastColumn="0" w:noHBand="0" w:noVBand="0" w:val="0000"/>
-      </w:tblPr>
-      <w:tblGrid>
-        <w:gridCol w:w="7920"/>
-      </w:tblGrid>
-      <w:tr>
-        <w:tc>
-          <w:tcPr/>
-          <w:bookmarkStart w:id="78" w:name="fig-539a35d47e664c97a50115a146a7f1bd-10"/>
-          <w:p>
-            <w:pPr>
-              <w:pStyle w:val="Compact"/>
-              <w:jc w:val="center"/>
-            </w:pPr>
-            <w:bookmarkStart w:id="77" w:name="fig-539a35d47e664c97a50115a146a7f1bd-10"/>
-            <w:r>
-              <w:drawing>
-                <wp:inline>
-                  <wp:extent cx="5943600" cy="8229600"/>
-                  <wp:effectExtent b="0" l="0" r="0" t="0"/>
-                  <wp:docPr descr=" " title="" id="75" name="Picture"/>
-                  <a:graphic>
-                    <a:graphicData uri="http://schemas.openxmlformats.org/drawingml/2006/picture">
-                      <pic:pic>
-                        <pic:nvPicPr>
-                          <pic:cNvPr descr="images/platform_dbl_10.png" id="76" name="Picture"/>
-                          <pic:cNvPicPr>
-                            <a:picLocks noChangeArrowheads="1" noChangeAspect="1"/>
-                          </pic:cNvPicPr>
-                        </pic:nvPicPr>
-                        <pic:blipFill>
-                          <a:blip r:embed="rId74"/>
-                          <a:stretch>
-                            <a:fillRect/>
-                          </a:stretch>
-                        </pic:blipFill>
-                        <pic:spPr bwMode="auto">
-                          <a:xfrm>
-                            <a:off x="0" y="0"/>
-                            <a:ext cx="5943600" cy="8229600"/>
-                          </a:xfrm>
-                          <a:prstGeom prst="rect">
-                            <a:avLst/>
-                          </a:prstGeom>
-                          <a:noFill/>
-                          <a:ln w="9525">
-                            <a:noFill/>
-                            <a:headEnd/>
-                            <a:tailEnd/>
-                          </a:ln>
-                        </pic:spPr>
-                      </pic:pic>
-                    </a:graphicData>
-                  </a:graphic>
-                </wp:inline>
-              </w:drawing>
-            </w:r>
-            <w:bookmarkEnd w:id="77"/>
-          </w:p>
-          <w:p>
-            <w:pPr>
-              <w:jc w:val="center"/>
-            </w:pPr>
-            <w:pPr>
-              <w:jc w:val="start"/>
-              <w:spacing w:before="200"/>
-              <w:pStyle w:val="ImageCaption"/>
-            </w:pPr>
-            <w:r>
-              <w:t xml:space="preserve"> </w:t>
-            </w:r>
-          </w:p>
-          <w:bookmarkEnd w:id="78"/>
-        </w:tc>
-      </w:tr>
-    </w:tbl>
-    <w:bookmarkEnd w:id="79"/>
-    <w:bookmarkStart w:id="85" w:name="step-11"/>
-    <w:p>
-      <w:pPr>
-        <w:pStyle w:val="Heading2"/>
-      </w:pPr>
-      <w:r>
-        <w:t xml:space="preserve">Step 11</w:t>
-      </w:r>
-    </w:p>
-    <w:p>
-      <w:pPr>
-        <w:numPr>
-          <w:ilvl w:val="0"/>
-          <w:numId w:val="1013"/>
         </w:numPr>
       </w:pPr>
       <w:r>
@@ -1945,7 +1608,7 @@
       <w:pPr>
         <w:numPr>
           <w:ilvl w:val="0"/>
-          <w:numId w:val="1013"/>
+          <w:numId w:val="1012"/>
         </w:numPr>
       </w:pPr>
       <w:r>
@@ -1986,114 +1649,80 @@
       <w:pPr>
         <w:numPr>
           <w:ilvl w:val="0"/>
+          <w:numId w:val="1012"/>
+        </w:numPr>
+      </w:pPr>
+      <w:r>
+        <w:t xml:space="preserve">Nail along edges and chalk lines</w:t>
+      </w:r>
+    </w:p>
+    <w:p>
+      <w:r>
+        <w:br w:type="page"/>
+      </w:r>
+    </w:p>
+    <w:p>
+      <w:pPr>
+        <w:pStyle w:val="FirstParagraph"/>
+      </w:pPr>
+      <w:r>
+        <w:drawing>
+          <wp:inline>
+            <wp:extent cx="5943600" cy="8229600"/>
+            <wp:effectExtent b="0" l="0" r="0" t="0"/>
+            <wp:docPr descr="" title="" id="61" name="Picture"/>
+            <a:graphic>
+              <a:graphicData uri="http://schemas.openxmlformats.org/drawingml/2006/picture">
+                <pic:pic>
+                  <pic:nvPicPr>
+                    <pic:cNvPr descr="images/platform_dbl_11.png" id="62" name="Picture"/>
+                    <pic:cNvPicPr>
+                      <a:picLocks noChangeArrowheads="1" noChangeAspect="1"/>
+                    </pic:cNvPicPr>
+                  </pic:nvPicPr>
+                  <pic:blipFill>
+                    <a:blip r:embed="rId60"/>
+                    <a:stretch>
+                      <a:fillRect/>
+                    </a:stretch>
+                  </pic:blipFill>
+                  <pic:spPr bwMode="auto">
+                    <a:xfrm>
+                      <a:off x="0" y="0"/>
+                      <a:ext cx="5943600" cy="8229600"/>
+                    </a:xfrm>
+                    <a:prstGeom prst="rect">
+                      <a:avLst/>
+                    </a:prstGeom>
+                    <a:noFill/>
+                    <a:ln w="9525">
+                      <a:noFill/>
+                      <a:headEnd/>
+                      <a:tailEnd/>
+                    </a:ln>
+                  </pic:spPr>
+                </pic:pic>
+              </a:graphicData>
+            </a:graphic>
+          </wp:inline>
+        </w:drawing>
+      </w:r>
+    </w:p>
+    <w:bookmarkEnd w:id="63"/>
+    <w:bookmarkStart w:id="67" w:name="step-12"/>
+    <w:p>
+      <w:pPr>
+        <w:pStyle w:val="Heading2"/>
+      </w:pPr>
+      <w:r>
+        <w:t xml:space="preserve">Step 12</w:t>
+      </w:r>
+    </w:p>
+    <w:p>
+      <w:pPr>
+        <w:numPr>
+          <w:ilvl w:val="0"/>
           <w:numId w:val="1013"/>
-        </w:numPr>
-      </w:pPr>
-      <w:r>
-        <w:t xml:space="preserve">Nail along edges and chalk lines</w:t>
-      </w:r>
-    </w:p>
-    <w:p>
-      <w:r>
-        <w:br w:type="page"/>
-      </w:r>
-    </w:p>
-    <w:tbl>
-      <w:tblPr>
-        <w:tblStyle w:val="Table"/>
-        <w:tblW w:type="pct" w:w="5000"/>
-        <w:tblLayout w:type="fixed"/>
-        <w:tblLook w:firstRow="0" w:lastRow="0" w:firstColumn="0" w:lastColumn="0" w:noHBand="0" w:noVBand="0" w:val="0000"/>
-      </w:tblPr>
-      <w:tblGrid>
-        <w:gridCol w:w="7920"/>
-      </w:tblGrid>
-      <w:tr>
-        <w:tc>
-          <w:tcPr/>
-          <w:bookmarkStart w:id="84" w:name="fig-539a35d47e664c97a50115a146a7f1bd-11"/>
-          <w:p>
-            <w:pPr>
-              <w:pStyle w:val="Compact"/>
-              <w:jc w:val="center"/>
-            </w:pPr>
-            <w:bookmarkStart w:id="83" w:name="fig-539a35d47e664c97a50115a146a7f1bd-11"/>
-            <w:r>
-              <w:drawing>
-                <wp:inline>
-                  <wp:extent cx="5943600" cy="8229600"/>
-                  <wp:effectExtent b="0" l="0" r="0" t="0"/>
-                  <wp:docPr descr=" " title="" id="81" name="Picture"/>
-                  <a:graphic>
-                    <a:graphicData uri="http://schemas.openxmlformats.org/drawingml/2006/picture">
-                      <pic:pic>
-                        <pic:nvPicPr>
-                          <pic:cNvPr descr="images/platform_dbl_11.png" id="82" name="Picture"/>
-                          <pic:cNvPicPr>
-                            <a:picLocks noChangeArrowheads="1" noChangeAspect="1"/>
-                          </pic:cNvPicPr>
-                        </pic:nvPicPr>
-                        <pic:blipFill>
-                          <a:blip r:embed="rId80"/>
-                          <a:stretch>
-                            <a:fillRect/>
-                          </a:stretch>
-                        </pic:blipFill>
-                        <pic:spPr bwMode="auto">
-                          <a:xfrm>
-                            <a:off x="0" y="0"/>
-                            <a:ext cx="5943600" cy="8229600"/>
-                          </a:xfrm>
-                          <a:prstGeom prst="rect">
-                            <a:avLst/>
-                          </a:prstGeom>
-                          <a:noFill/>
-                          <a:ln w="9525">
-                            <a:noFill/>
-                            <a:headEnd/>
-                            <a:tailEnd/>
-                          </a:ln>
-                        </pic:spPr>
-                      </pic:pic>
-                    </a:graphicData>
-                  </a:graphic>
-                </wp:inline>
-              </w:drawing>
-            </w:r>
-            <w:bookmarkEnd w:id="83"/>
-          </w:p>
-          <w:p>
-            <w:pPr>
-              <w:jc w:val="center"/>
-            </w:pPr>
-            <w:pPr>
-              <w:jc w:val="start"/>
-              <w:spacing w:before="200"/>
-              <w:pStyle w:val="ImageCaption"/>
-            </w:pPr>
-            <w:r>
-              <w:t xml:space="preserve"> </w:t>
-            </w:r>
-          </w:p>
-          <w:bookmarkEnd w:id="84"/>
-        </w:tc>
-      </w:tr>
-    </w:tbl>
-    <w:bookmarkEnd w:id="85"/>
-    <w:bookmarkStart w:id="91" w:name="step-12"/>
-    <w:p>
-      <w:pPr>
-        <w:pStyle w:val="Heading2"/>
-      </w:pPr>
-      <w:r>
-        <w:t xml:space="preserve">Step 12</w:t>
-      </w:r>
-    </w:p>
-    <w:p>
-      <w:pPr>
-        <w:numPr>
-          <w:ilvl w:val="0"/>
-          <w:numId w:val="1014"/>
         </w:numPr>
       </w:pPr>
       <w:r>
@@ -2122,7 +1751,7 @@
       <w:pPr>
         <w:numPr>
           <w:ilvl w:val="0"/>
-          <w:numId w:val="1014"/>
+          <w:numId w:val="1013"/>
         </w:numPr>
       </w:pPr>
       <w:r>
@@ -2163,11 +1792,119 @@
       <w:pPr>
         <w:numPr>
           <w:ilvl w:val="0"/>
+          <w:numId w:val="1013"/>
+        </w:numPr>
+      </w:pPr>
+      <w:r>
+        <w:t xml:space="preserve">Nail along edges and chalk lines</w:t>
+      </w:r>
+    </w:p>
+    <w:p>
+      <w:r>
+        <w:br w:type="page"/>
+      </w:r>
+    </w:p>
+    <w:p>
+      <w:pPr>
+        <w:pStyle w:val="FirstParagraph"/>
+      </w:pPr>
+      <w:r>
+        <w:drawing>
+          <wp:inline>
+            <wp:extent cx="5943600" cy="8229600"/>
+            <wp:effectExtent b="0" l="0" r="0" t="0"/>
+            <wp:docPr descr="" title="" id="65" name="Picture"/>
+            <a:graphic>
+              <a:graphicData uri="http://schemas.openxmlformats.org/drawingml/2006/picture">
+                <pic:pic>
+                  <pic:nvPicPr>
+                    <pic:cNvPr descr="images/platform_dbl_12.png" id="66" name="Picture"/>
+                    <pic:cNvPicPr>
+                      <a:picLocks noChangeArrowheads="1" noChangeAspect="1"/>
+                    </pic:cNvPicPr>
+                  </pic:nvPicPr>
+                  <pic:blipFill>
+                    <a:blip r:embed="rId64"/>
+                    <a:stretch>
+                      <a:fillRect/>
+                    </a:stretch>
+                  </pic:blipFill>
+                  <pic:spPr bwMode="auto">
+                    <a:xfrm>
+                      <a:off x="0" y="0"/>
+                      <a:ext cx="5943600" cy="8229600"/>
+                    </a:xfrm>
+                    <a:prstGeom prst="rect">
+                      <a:avLst/>
+                    </a:prstGeom>
+                    <a:noFill/>
+                    <a:ln w="9525">
+                      <a:noFill/>
+                      <a:headEnd/>
+                      <a:tailEnd/>
+                    </a:ln>
+                  </pic:spPr>
+                </pic:pic>
+              </a:graphicData>
+            </a:graphic>
+          </wp:inline>
+        </w:drawing>
+      </w:r>
+    </w:p>
+    <w:bookmarkEnd w:id="67"/>
+    <w:bookmarkStart w:id="71" w:name="step-13"/>
+    <w:p>
+      <w:pPr>
+        <w:pStyle w:val="Heading2"/>
+      </w:pPr>
+      <w:r>
+        <w:t xml:space="preserve">Step 13</w:t>
+      </w:r>
+    </w:p>
+    <w:p>
+      <w:pPr>
+        <w:numPr>
+          <w:ilvl w:val="0"/>
           <w:numId w:val="1014"/>
         </w:numPr>
       </w:pPr>
       <w:r>
-        <w:t xml:space="preserve">Nail along edges and chalk lines</w:t>
+        <w:t xml:space="preserve">The next day, if necessary, router the edges of the platform (to let the</w:t>
+      </w:r>
+      <w:r>
+        <w:t xml:space="preserve"> </w:t>
+      </w:r>
+      <w:r>
+        <w:t xml:space="preserve">adhesive dry first).</w:t>
+      </w:r>
+    </w:p>
+    <w:p>
+      <w:pPr>
+        <w:numPr>
+          <w:ilvl w:val="0"/>
+          <w:numId w:val="1014"/>
+        </w:numPr>
+      </w:pPr>
+      <w:r>
+        <w:t xml:space="preserve">Draw a line 3½ inches from the edge on all sides</w:t>
+      </w:r>
+      <w:r>
+        <w:br/>
+      </w:r>
+      <w:r>
+        <w:t xml:space="preserve">— use the marking jig; it hangs from the back saw table. Using a</w:t>
+      </w:r>
+      <w:r>
+        <w:t xml:space="preserve"> </w:t>
+      </w:r>
+      <w:r>
+        <w:t xml:space="preserve">felt-tip pen, hold it against the inside of the jig, and slide the jig</w:t>
+      </w:r>
+      <w:r>
+        <w:t xml:space="preserve"> </w:t>
+      </w:r>
+      <w:r>
+        <w:t xml:space="preserve">along the sides of the platform.</w:t>
       </w:r>
     </w:p>
     <w:p>
@@ -2175,231 +1912,55 @@
         <w:br w:type="page"/>
       </w:r>
     </w:p>
-    <w:tbl>
-      <w:tblPr>
-        <w:tblStyle w:val="Table"/>
-        <w:tblW w:type="pct" w:w="5000"/>
-        <w:tblLayout w:type="fixed"/>
-        <w:tblLook w:firstRow="0" w:lastRow="0" w:firstColumn="0" w:lastColumn="0" w:noHBand="0" w:noVBand="0" w:val="0000"/>
-      </w:tblPr>
-      <w:tblGrid>
-        <w:gridCol w:w="7920"/>
-      </w:tblGrid>
-      <w:tr>
-        <w:tc>
-          <w:tcPr/>
-          <w:bookmarkStart w:id="90" w:name="fig-539a35d47e664c97a50115a146a7f1bd-12"/>
-          <w:p>
-            <w:pPr>
-              <w:pStyle w:val="Compact"/>
-              <w:jc w:val="center"/>
-            </w:pPr>
-            <w:bookmarkStart w:id="89" w:name="fig-539a35d47e664c97a50115a146a7f1bd-12"/>
-            <w:r>
-              <w:drawing>
-                <wp:inline>
-                  <wp:extent cx="5943600" cy="8229600"/>
-                  <wp:effectExtent b="0" l="0" r="0" t="0"/>
-                  <wp:docPr descr=" " title="" id="87" name="Picture"/>
-                  <a:graphic>
-                    <a:graphicData uri="http://schemas.openxmlformats.org/drawingml/2006/picture">
-                      <pic:pic>
-                        <pic:nvPicPr>
-                          <pic:cNvPr descr="images/platform_dbl_12.png" id="88" name="Picture"/>
-                          <pic:cNvPicPr>
-                            <a:picLocks noChangeArrowheads="1" noChangeAspect="1"/>
-                          </pic:cNvPicPr>
-                        </pic:nvPicPr>
-                        <pic:blipFill>
-                          <a:blip r:embed="rId86"/>
-                          <a:stretch>
-                            <a:fillRect/>
-                          </a:stretch>
-                        </pic:blipFill>
-                        <pic:spPr bwMode="auto">
-                          <a:xfrm>
-                            <a:off x="0" y="0"/>
-                            <a:ext cx="5943600" cy="8229600"/>
-                          </a:xfrm>
-                          <a:prstGeom prst="rect">
-                            <a:avLst/>
-                          </a:prstGeom>
-                          <a:noFill/>
-                          <a:ln w="9525">
-                            <a:noFill/>
-                            <a:headEnd/>
-                            <a:tailEnd/>
-                          </a:ln>
-                        </pic:spPr>
-                      </pic:pic>
-                    </a:graphicData>
-                  </a:graphic>
-                </wp:inline>
-              </w:drawing>
-            </w:r>
-            <w:bookmarkEnd w:id="89"/>
-          </w:p>
-          <w:p>
-            <w:pPr>
-              <w:jc w:val="center"/>
-            </w:pPr>
-            <w:pPr>
-              <w:jc w:val="start"/>
-              <w:spacing w:before="200"/>
-              <w:pStyle w:val="ImageCaption"/>
-            </w:pPr>
-            <w:r>
-              <w:t xml:space="preserve"> </w:t>
-            </w:r>
-          </w:p>
-          <w:bookmarkEnd w:id="90"/>
-        </w:tc>
-      </w:tr>
-    </w:tbl>
-    <w:bookmarkEnd w:id="91"/>
-    <w:bookmarkStart w:id="97" w:name="step-13"/>
-    <w:p>
-      <w:pPr>
-        <w:pStyle w:val="Heading2"/>
-      </w:pPr>
-      <w:r>
-        <w:t xml:space="preserve">Step 13</w:t>
-      </w:r>
-    </w:p>
-    <w:p>
-      <w:pPr>
-        <w:numPr>
-          <w:ilvl w:val="0"/>
-          <w:numId w:val="1015"/>
-        </w:numPr>
-      </w:pPr>
-      <w:r>
-        <w:t xml:space="preserve">The next day, if necessary, router the edges of the platform (to let the</w:t>
-      </w:r>
-      <w:r>
-        <w:t xml:space="preserve"> </w:t>
-      </w:r>
-      <w:r>
-        <w:t xml:space="preserve">adhesive dry first).</w:t>
-      </w:r>
-    </w:p>
-    <w:p>
-      <w:pPr>
-        <w:numPr>
-          <w:ilvl w:val="0"/>
-          <w:numId w:val="1015"/>
-        </w:numPr>
-      </w:pPr>
-      <w:r>
-        <w:t xml:space="preserve">Draw a line 3½ inches from the edge on all sides</w:t>
-      </w:r>
-      <w:r>
-        <w:br/>
-      </w:r>
-      <w:r>
-        <w:t xml:space="preserve">— use the marking jig; it hangs from the back saw table. Using a</w:t>
-      </w:r>
-      <w:r>
-        <w:t xml:space="preserve"> </w:t>
-      </w:r>
-      <w:r>
-        <w:t xml:space="preserve">felt-tip pen, hold it against the inside of the jig, and slide the jig</w:t>
-      </w:r>
-      <w:r>
-        <w:t xml:space="preserve"> </w:t>
-      </w:r>
-      <w:r>
-        <w:t xml:space="preserve">along the sides of the platform.</w:t>
-      </w:r>
-    </w:p>
-    <w:p>
-      <w:r>
-        <w:br w:type="page"/>
-      </w:r>
-    </w:p>
-    <w:tbl>
-      <w:tblPr>
-        <w:tblStyle w:val="Table"/>
-        <w:tblW w:type="pct" w:w="5000"/>
-        <w:tblLayout w:type="fixed"/>
-        <w:tblLook w:firstRow="0" w:lastRow="0" w:firstColumn="0" w:lastColumn="0" w:noHBand="0" w:noVBand="0" w:val="0000"/>
-      </w:tblPr>
-      <w:tblGrid>
-        <w:gridCol w:w="7920"/>
-      </w:tblGrid>
-      <w:tr>
-        <w:tc>
-          <w:tcPr/>
-          <w:bookmarkStart w:id="96" w:name="fig-539a35d47e664c97a50115a146a7f1bd-13"/>
-          <w:p>
-            <w:pPr>
-              <w:pStyle w:val="Compact"/>
-              <w:jc w:val="center"/>
-            </w:pPr>
-            <w:bookmarkStart w:id="95" w:name="fig-539a35d47e664c97a50115a146a7f1bd-13"/>
-            <w:r>
-              <w:drawing>
-                <wp:inline>
-                  <wp:extent cx="5943600" cy="8229600"/>
-                  <wp:effectExtent b="0" l="0" r="0" t="0"/>
-                  <wp:docPr descr=" " title="" id="93" name="Picture"/>
-                  <a:graphic>
-                    <a:graphicData uri="http://schemas.openxmlformats.org/drawingml/2006/picture">
-                      <pic:pic>
-                        <pic:nvPicPr>
-                          <pic:cNvPr descr="images/platform_dbl_13.png" id="94" name="Picture"/>
-                          <pic:cNvPicPr>
-                            <a:picLocks noChangeArrowheads="1" noChangeAspect="1"/>
-                          </pic:cNvPicPr>
-                        </pic:nvPicPr>
-                        <pic:blipFill>
-                          <a:blip r:embed="rId92"/>
-                          <a:stretch>
-                            <a:fillRect/>
-                          </a:stretch>
-                        </pic:blipFill>
-                        <pic:spPr bwMode="auto">
-                          <a:xfrm>
-                            <a:off x="0" y="0"/>
-                            <a:ext cx="5943600" cy="8229600"/>
-                          </a:xfrm>
-                          <a:prstGeom prst="rect">
-                            <a:avLst/>
-                          </a:prstGeom>
-                          <a:noFill/>
-                          <a:ln w="9525">
-                            <a:noFill/>
-                            <a:headEnd/>
-                            <a:tailEnd/>
-                          </a:ln>
-                        </pic:spPr>
-                      </pic:pic>
-                    </a:graphicData>
-                  </a:graphic>
-                </wp:inline>
-              </w:drawing>
-            </w:r>
-            <w:bookmarkEnd w:id="95"/>
-          </w:p>
-          <w:p>
-            <w:pPr>
-              <w:jc w:val="center"/>
-            </w:pPr>
-            <w:pPr>
-              <w:jc w:val="start"/>
-              <w:spacing w:before="200"/>
-              <w:pStyle w:val="ImageCaption"/>
-            </w:pPr>
-            <w:r>
-              <w:t xml:space="preserve"> </w:t>
-            </w:r>
-          </w:p>
-          <w:bookmarkEnd w:id="96"/>
-        </w:tc>
-      </w:tr>
-    </w:tbl>
-    <w:bookmarkEnd w:id="97"/>
-    <w:bookmarkEnd w:id="98"/>
+    <w:p>
+      <w:pPr>
+        <w:pStyle w:val="FirstParagraph"/>
+      </w:pPr>
+      <w:r>
+        <w:drawing>
+          <wp:inline>
+            <wp:extent cx="5943600" cy="8229600"/>
+            <wp:effectExtent b="0" l="0" r="0" t="0"/>
+            <wp:docPr descr="" title="" id="69" name="Picture"/>
+            <a:graphic>
+              <a:graphicData uri="http://schemas.openxmlformats.org/drawingml/2006/picture">
+                <pic:pic>
+                  <pic:nvPicPr>
+                    <pic:cNvPr descr="images/platform_dbl_13.png" id="70" name="Picture"/>
+                    <pic:cNvPicPr>
+                      <a:picLocks noChangeArrowheads="1" noChangeAspect="1"/>
+                    </pic:cNvPicPr>
+                  </pic:nvPicPr>
+                  <pic:blipFill>
+                    <a:blip r:embed="rId68"/>
+                    <a:stretch>
+                      <a:fillRect/>
+                    </a:stretch>
+                  </pic:blipFill>
+                  <pic:spPr bwMode="auto">
+                    <a:xfrm>
+                      <a:off x="0" y="0"/>
+                      <a:ext cx="5943600" cy="8229600"/>
+                    </a:xfrm>
+                    <a:prstGeom prst="rect">
+                      <a:avLst/>
+                    </a:prstGeom>
+                    <a:noFill/>
+                    <a:ln w="9525">
+                      <a:noFill/>
+                      <a:headEnd/>
+                      <a:tailEnd/>
+                    </a:ln>
+                  </pic:spPr>
+                </pic:pic>
+              </a:graphicData>
+            </a:graphic>
+          </wp:inline>
+        </w:drawing>
+      </w:r>
+    </w:p>
+    <w:bookmarkEnd w:id="71"/>
+    <w:bookmarkEnd w:id="72"/>
     <w:sectPr>
       <w:headerReference r:id="rId9" w:type="even"/>
       <w:headerReference r:id="rId11" w:type="default"/>
@@ -2438,52 +1999,88 @@
       <w:pBdr>
         <w:top w:val="single" w:sz="4" w:space="1" w:color="BFBFBF" w:themeColor="background1" w:themeShade="BF"/>
       </w:pBdr>
+      <w:rPr>
+        <w:sz w:val="22"/>
+      </w:rPr>
     </w:pPr>
     <w:r>
+      <w:rPr>
+        <w:sz w:val="22"/>
+      </w:rPr>
       <w:t>Sound Foundations NW</w:t>
     </w:r>
     <w:r>
+      <w:rPr>
+        <w:sz w:val="22"/>
+      </w:rPr>
       <w:ptab w:relativeTo="margin" w:alignment="center" w:leader="none"/>
     </w:r>
     <w:r>
+      <w:rPr>
+        <w:sz w:val="22"/>
+      </w:rPr>
       <w:fldChar w:fldCharType="begin"/>
     </w:r>
     <w:r>
+      <w:rPr>
+        <w:sz w:val="22"/>
+      </w:rPr>
       <w:instrText xml:space="preserve"> SAVEDATE  \@ "d MMMM yyyy"  \* MERGEFORMAT </w:instrText>
     </w:r>
     <w:r>
+      <w:rPr>
+        <w:sz w:val="22"/>
+      </w:rPr>
       <w:fldChar w:fldCharType="separate"/>
     </w:r>
     <w:r>
       <w:rPr>
         <w:noProof/>
+        <w:sz w:val="22"/>
       </w:rPr>
-      <w:t>24 January 2025</w:t>
+      <w:t>30 January 2025</w:t>
     </w:r>
     <w:r>
+      <w:rPr>
+        <w:sz w:val="22"/>
+      </w:rPr>
       <w:fldChar w:fldCharType="end"/>
     </w:r>
     <w:r>
+      <w:rPr>
+        <w:sz w:val="22"/>
+      </w:rPr>
       <w:ptab w:relativeTo="margin" w:alignment="right" w:leader="none"/>
     </w:r>
     <w:r>
+      <w:rPr>
+        <w:sz w:val="22"/>
+      </w:rPr>
       <w:fldChar w:fldCharType="begin"/>
     </w:r>
     <w:r>
+      <w:rPr>
+        <w:sz w:val="22"/>
+      </w:rPr>
       <w:instrText xml:space="preserve"> PAGE   \* MERGEFORMAT </w:instrText>
     </w:r>
     <w:r>
+      <w:rPr>
+        <w:sz w:val="22"/>
+      </w:rPr>
       <w:fldChar w:fldCharType="separate"/>
     </w:r>
     <w:r>
       <w:rPr>
         <w:noProof/>
+        <w:sz w:val="22"/>
       </w:rPr>
       <w:t>1</w:t>
     </w:r>
     <w:r>
       <w:rPr>
         <w:noProof/>
+        <w:sz w:val="22"/>
       </w:rPr>
       <w:fldChar w:fldCharType="end"/>
     </w:r>
@@ -2890,9 +2487,6 @@
     <w:abstractNumId w:val="991"/>
   </w:num>
   <w:num w:numId="1014">
-    <w:abstractNumId w:val="991"/>
-  </w:num>
-  <w:num w:numId="1015">
     <w:abstractNumId w:val="991"/>
   </w:num>
 </w:numbering>
@@ -3296,6 +2890,10 @@
   <w:style w:default="1" w:styleId="Normal" w:type="paragraph">
     <w:name w:val="Normal"/>
     <w:qFormat/>
+    <w:rsid w:val="0033722B"/>
+    <w:rPr>
+      <w:sz w:val="28"/>
+    </w:rPr>
   </w:style>
   <w:style w:styleId="Heading1" w:type="paragraph">
     <w:name w:val="heading 1"/>
@@ -3347,6 +2945,50 @@
       <w:szCs w:val="36"/>
     </w:rPr>
   </w:style>
+  <w:style w:styleId="Heading3" w:type="paragraph">
+    <w:name w:val="heading 3"/>
+    <w:basedOn w:val="Normal"/>
+    <w:next w:val="Normal"/>
+    <w:link w:val="Heading3Char"/>
+    <w:uiPriority w:val="9"/>
+    <w:unhideWhenUsed/>
+    <w:qFormat/>
+    <w:rsid w:val="005B3D4E"/>
+    <w:pPr>
+      <w:keepNext/>
+      <w:keepLines/>
+      <w:spacing w:after="0" w:before="40"/>
+      <w:outlineLvl w:val="2"/>
+    </w:pPr>
+    <w:rPr>
+      <w:rFonts w:ascii="Arial" w:cstheme="majorBidi" w:eastAsiaTheme="majorEastAsia" w:hAnsi="Arial"/>
+      <w:color w:themeColor="accent1" w:themeShade="7F" w:val="243F60"/>
+      <w:sz w:val="32"/>
+      <w:szCs w:val="24"/>
+    </w:rPr>
+  </w:style>
+  <w:style w:styleId="Heading4" w:type="paragraph">
+    <w:name w:val="heading 4"/>
+    <w:basedOn w:val="Normal"/>
+    <w:next w:val="Normal"/>
+    <w:link w:val="Heading4Char"/>
+    <w:uiPriority w:val="9"/>
+    <w:unhideWhenUsed/>
+    <w:qFormat/>
+    <w:rsid w:val="005B3D4E"/>
+    <w:pPr>
+      <w:keepNext/>
+      <w:keepLines/>
+      <w:spacing w:after="0" w:before="40"/>
+      <w:outlineLvl w:val="3"/>
+    </w:pPr>
+    <w:rPr>
+      <w:rFonts w:asciiTheme="majorHAnsi" w:cstheme="majorBidi" w:eastAsiaTheme="majorEastAsia" w:hAnsiTheme="majorHAnsi"/>
+      <w:i/>
+      <w:iCs/>
+      <w:color w:themeColor="accent1" w:themeShade="BF" w:val="365F91"/>
+    </w:rPr>
+  </w:style>
   <w:style w:default="1" w:styleId="DefaultParagraphFont" w:type="character">
     <w:name w:val="Default Paragraph Font"/>
     <w:uiPriority w:val="1"/>
@@ -3535,6 +3177,44 @@
       <w:ind w:left="720"/>
       <w:contextualSpacing/>
     </w:pPr>
+  </w:style>
+  <w:style w:customStyle="1" w:styleId="Heading3Char" w:type="character">
+    <w:name w:val="Heading 3 Char"/>
+    <w:basedOn w:val="DefaultParagraphFont"/>
+    <w:link w:val="Heading3"/>
+    <w:uiPriority w:val="9"/>
+    <w:rsid w:val="005B3D4E"/>
+    <w:rPr>
+      <w:rFonts w:ascii="Arial" w:cstheme="majorBidi" w:eastAsiaTheme="majorEastAsia" w:hAnsi="Arial"/>
+      <w:color w:themeColor="accent1" w:themeShade="7F" w:val="243F60"/>
+      <w:sz w:val="32"/>
+      <w:szCs w:val="24"/>
+    </w:rPr>
+  </w:style>
+  <w:style w:customStyle="1" w:styleId="Heading4Char" w:type="character">
+    <w:name w:val="Heading 4 Char"/>
+    <w:basedOn w:val="DefaultParagraphFont"/>
+    <w:link w:val="Heading4"/>
+    <w:uiPriority w:val="9"/>
+    <w:rsid w:val="005B3D4E"/>
+    <w:rPr>
+      <w:rFonts w:asciiTheme="majorHAnsi" w:cstheme="majorBidi" w:eastAsiaTheme="majorEastAsia" w:hAnsiTheme="majorHAnsi"/>
+      <w:i/>
+      <w:iCs/>
+      <w:color w:themeColor="accent1" w:themeShade="BF" w:val="365F91"/>
+    </w:rPr>
+  </w:style>
+  <w:style w:styleId="NoSpacing" w:type="paragraph">
+    <w:name w:val="No Spacing"/>
+    <w:uiPriority w:val="1"/>
+    <w:qFormat/>
+    <w:rsid w:val="0033722B"/>
+    <w:pPr>
+      <w:spacing w:after="0" w:line="240" w:lineRule="auto"/>
+    </w:pPr>
+    <w:rPr>
+      <w:sz w:val="28"/>
+    </w:rPr>
   </w:style>
   <w:style w:type="paragraph" w:customStyle="1" w:styleId="SourceCode">
     <w:name w:val="Source Code"/>

</xml_diff>